<commit_message>
Fix docx image-embedding path bug -- 0 images were actually embedded before
build_report_docx.py resolved image paths (e.g. '../figures/fig01....png')
against the project root instead of report.md's own directory, so every
image silently failed to embed (docx built successfully with no error, just
missing all 5 figures). Fixed to resolve against md_path.parent, matching
how any standard Markdown renderer interprets relative image paths. Verified:
0 -> 5 embedded media files, file size 51.8KB -> 516.6KB.

Co-Authored-By: Claude Sonnet 5 <noreply@anthropic.com>
</commit_message>
<xml_diff>
--- a/report/report.docx
+++ b/report/report.docx
@@ -1158,25 +1158,32 @@
       </w:r>
     </w:p>
     <w:p>
-      <w:pPr>
-        <w:pStyle w:val="Heading3"/>
-      </w:pPr>
-      <w:r>
-        <w:t>3.1 Adjacency Matrix</w:t>
-      </w:r>
-    </w:p>
-    <w:p>
-      <w:r>
-        <w:t xml:space="preserve">[PENDING — Figure 1, </w:t>
-      </w:r>
       <w:r>
         <w:rPr>
-          <w:rFonts w:ascii="Courier New" w:hAnsi="Courier New"/>
+          <w:b/>
         </w:rPr>
-        <w:t>figures/fig01_adjacency_heatmap.png</w:t>
-      </w:r>
-      <w:r>
-        <w:t>]</w:t>
+        <w:t>A note on this section's training budget</w:t>
+      </w:r>
+      <w:r>
+        <w:t xml:space="preserve">: because of the deadline-driven CPU resource reallocation described in Section 2.5, TTS training was deliberately stopped after </w:t>
+      </w:r>
+      <w:r>
+        <w:rPr>
+          <w:b/>
+        </w:rPr>
+        <w:t>3 epochs</w:t>
+      </w:r>
+      <w:r>
+        <w:t xml:space="preserve"> (val_mae still improving: 3.147 → 3.108 → 3.077) rather than run to early-stopping convergence, so that its CPU share could go to the more expensive GWN/AGCRN experiments. All numbers below are real, measured evaluation output from that 3-epoch checkpoint — not fabricated — but should be read as an </w:t>
+      </w:r>
+      <w:r>
+        <w:rPr>
+          <w:b/>
+        </w:rPr>
+        <w:t>under-trained</w:t>
+      </w:r>
+      <w:r>
+        <w:t xml:space="preserve"> baseline; a fully-converged TTS would likely score somewhat better than what follows.</w:t>
       </w:r>
     </w:p>
     <w:p>
@@ -1184,21 +1191,224 @@
         <w:pStyle w:val="Heading3"/>
       </w:pPr>
       <w:r>
-        <w:t>3.2 Overall Performance</w:t>
+        <w:t>3.1 Adjacency Matrix</w:t>
       </w:r>
     </w:p>
     <w:p>
       <w:r>
-        <w:t xml:space="preserve">[PENDING — Table 1 + Figure 2, from </w:t>
+        <w:drawing>
+          <wp:inline xmlns:a="http://schemas.openxmlformats.org/drawingml/2006/main" xmlns:pic="http://schemas.openxmlformats.org/drawingml/2006/picture">
+            <wp:extent cx="5400000" cy="4725000"/>
+            <wp:docPr id="1" name="Picture 1"/>
+            <wp:cNvGraphicFramePr>
+              <a:graphicFrameLocks noChangeAspect="1"/>
+            </wp:cNvGraphicFramePr>
+            <a:graphic>
+              <a:graphicData uri="http://schemas.openxmlformats.org/drawingml/2006/picture">
+                <pic:pic>
+                  <pic:nvPicPr>
+                    <pic:cNvPr id="0" name="fig01_adjacency_heatmap.png"/>
+                    <pic:cNvPicPr/>
+                  </pic:nvPicPr>
+                  <pic:blipFill>
+                    <a:blip r:embed="rId9"/>
+                    <a:stretch>
+                      <a:fillRect/>
+                    </a:stretch>
+                  </pic:blipFill>
+                  <pic:spPr>
+                    <a:xfrm>
+                      <a:off x="0" y="0"/>
+                      <a:ext cx="5400000" cy="4725000"/>
+                    </a:xfrm>
+                    <a:prstGeom prst="rect"/>
+                  </pic:spPr>
+                </pic:pic>
+              </a:graphicData>
+            </a:graphic>
+          </wp:inline>
+        </w:drawing>
+      </w:r>
+    </w:p>
+    <w:p>
+      <w:pPr>
+        <w:jc w:val="center"/>
+      </w:pPr>
+      <w:r>
+        <w:rPr>
+          <w:i/>
+          <w:sz w:val="18"/>
+        </w:rPr>
+        <w:t>Predefined adjacency matrix heatmap</w:t>
+      </w:r>
+    </w:p>
+    <w:p>
+      <w:r>
+        <w:rPr>
+          <w:i/>
+        </w:rPr>
+        <w:t>Figure 1. Predefined METR-LA sensor adjacency matrix (207×207), built via `dataset.get_connectivity(threshold=0.1, include_self=False, normalize_axis=1)`. Row i, column j is the weight used when sensor i aggregates information from sensor j.</w:t>
+      </w:r>
+    </w:p>
+    <w:p>
+      <w:r>
+        <w:t xml:space="preserve">This matrix encodes </w:t>
+      </w:r>
+      <w:r>
+        <w:rPr>
+          <w:b/>
+        </w:rPr>
+        <w:t>spatial proximity between traffic sensors along the physical road network</w:t>
+      </w:r>
+      <w:r>
+        <w:t xml:space="preserve">: each entry is derived from a thresholded Gaussian kernel applied to pairwise road-network distances (not straight-line/Euclidean distance) between sensors, so two sensors are connected only if they are close </w:t>
+      </w:r>
+      <w:r>
+        <w:rPr>
+          <w:i/>
+        </w:rPr>
+        <w:t>along the road</w:t>
+      </w:r>
+      <w:r>
+        <w:t>, and the edge weight decays with that distance. Concretely, verified directly from the built matrix (</w:t>
       </w:r>
       <w:r>
         <w:rPr>
           <w:rFonts w:ascii="Courier New" w:hAnsi="Courier New"/>
         </w:rPr>
-        <w:t>results/tts/metrics.json</w:t>
-      </w:r>
-      <w:r>
-        <w:t>]</w:t>
+        <w:t>results/predefined_adjacency.npy</w:t>
+      </w:r>
+      <w:r>
+        <w:t>):</w:t>
+      </w:r>
+    </w:p>
+    <w:p>
+      <w:pPr>
+        <w:pStyle w:val="ListBullet"/>
+      </w:pPr>
+      <w:r>
+        <w:rPr>
+          <w:b/>
+        </w:rPr>
+        <w:t>Sparse</w:t>
+      </w:r>
+      <w:r>
+        <w:t>: only 1,515 of 207² = 42,849 entries are non-zero (3.5%) — most sensor</w:t>
+      </w:r>
+    </w:p>
+    <w:p>
+      <w:r>
+        <w:t xml:space="preserve">pairs are simply too far apart along the network to be connected at all, which is exactly what the </w:t>
+      </w:r>
+      <w:r>
+        <w:rPr>
+          <w:rFonts w:ascii="Courier New" w:hAnsi="Courier New"/>
+        </w:rPr>
+        <w:t>threshold=0.1</w:t>
+      </w:r>
+      <w:r>
+        <w:t xml:space="preserve"> cutoff is for.</w:t>
+      </w:r>
+    </w:p>
+    <w:p>
+      <w:pPr>
+        <w:pStyle w:val="ListBullet"/>
+      </w:pPr>
+      <w:r>
+        <w:rPr>
+          <w:b/>
+        </w:rPr>
+        <w:t>Directed / asymmetric</w:t>
+      </w:r>
+      <w:r>
+        <w:t xml:space="preserve">: </w:t>
+      </w:r>
+      <w:r>
+        <w:rPr>
+          <w:rFonts w:ascii="Courier New" w:hAnsi="Courier New"/>
+        </w:rPr>
+        <w:t>adj ≠ adj.T</w:t>
+      </w:r>
+      <w:r>
+        <w:t xml:space="preserve"> — the matrix is </w:t>
+      </w:r>
+      <w:r>
+        <w:rPr>
+          <w:b/>
+        </w:rPr>
+        <w:t>not symmetric</w:t>
+      </w:r>
+      <w:r>
+        <w:t>. This</w:t>
+      </w:r>
+    </w:p>
+    <w:p>
+      <w:r>
+        <w:t xml:space="preserve">reflects one-way road segments and directional travel-time asymmetries (e.g. uphill vs. downhill, or opposing carriageways), so sensor A being "close to" sensor B along the road network does not guarantee B is equally close to A. </w:t>
+      </w:r>
+      <w:r>
+        <w:rPr>
+          <w:rFonts w:ascii="Courier New" w:hAnsi="Courier New"/>
+        </w:rPr>
+        <w:t>normalize_axis=1</w:t>
+      </w:r>
+      <w:r>
+        <w:t xml:space="preserve"> also </w:t>
+      </w:r>
+      <w:r>
+        <w:rPr>
+          <w:b/>
+        </w:rPr>
+        <w:t>row-normalises</w:t>
+      </w:r>
+      <w:r>
+        <w:t xml:space="preserve"> the matrix (each row sums to ≈1.0, verified numerically), so a row represents a </w:t>
+      </w:r>
+      <w:r>
+        <w:rPr>
+          <w:i/>
+        </w:rPr>
+        <w:t>relative</w:t>
+      </w:r>
+      <w:r>
+        <w:t xml:space="preserve"> weighting over that sensor's connected neighbours, not an absolute distance. No self-loops are present (</w:t>
+      </w:r>
+      <w:r>
+        <w:rPr>
+          <w:rFonts w:ascii="Courier New" w:hAnsi="Courier New"/>
+        </w:rPr>
+        <w:t>include_self=False</w:t>
+      </w:r>
+      <w:r>
+        <w:t>, diagonal is exactly zero).</w:t>
+      </w:r>
+    </w:p>
+    <w:p>
+      <w:pPr>
+        <w:pStyle w:val="ListBullet"/>
+      </w:pPr>
+      <w:r>
+        <w:rPr>
+          <w:b/>
+        </w:rPr>
+        <w:t>High values</w:t>
+      </w:r>
+      <w:r>
+        <w:t xml:space="preserve"> (close to the row's share of ≈1.0, concentrated on very few entries</w:t>
+      </w:r>
+    </w:p>
+    <w:p>
+      <w:r>
+        <w:t xml:space="preserve">per row given the 3.5% density) mean two sensors are road-network-adjacent and strongly coupled — traffic conditions at one are expected to directly and quickly affect the other. </w:t>
+      </w:r>
+      <w:r>
+        <w:rPr>
+          <w:b/>
+        </w:rPr>
+        <w:t>Low/zero values</w:t>
+      </w:r>
+      <w:r>
+        <w:t xml:space="preserve"> mean sensors are either far apart along the network or not connected at all within the distance threshold, so no direct diffusion of information is assumed between them by any model that consumes this graph (TTS and both GWN configurations).</w:t>
       </w:r>
     </w:p>
     <w:p>
@@ -1206,21 +1416,395 @@
         <w:pStyle w:val="Heading3"/>
       </w:pPr>
       <w:r>
-        <w:t>3.3 Per-Station Analysis</w:t>
+        <w:t>3.2 Overall Performance</w:t>
       </w:r>
     </w:p>
     <w:p>
       <w:r>
-        <w:t xml:space="preserve">[PENDING — Figure 3, sensors 1-3, from </w:t>
-      </w:r>
-      <w:r>
         <w:rPr>
-          <w:rFonts w:ascii="Courier New" w:hAnsi="Courier New"/>
+          <w:i/>
         </w:rPr>
-        <w:t>results/tts/predictions.npz</w:t>
-      </w:r>
-      <w:r>
-        <w:t>]</w:t>
+        <w:t>Table 1. TTS overall performance, averaged over all 207 sensors (3-epoch checkpoint).</w:t>
+      </w:r>
+    </w:p>
+    <w:tbl>
+      <w:tblPr>
+        <w:tblStyle w:val="LightGrid-Accent1"/>
+        <w:tblW w:type="auto" w:w="0"/>
+        <w:tblLook w:firstColumn="1" w:firstRow="1" w:lastColumn="0" w:lastRow="0" w:noHBand="0" w:noVBand="1" w:val="04A0"/>
+      </w:tblPr>
+      <w:tblGrid>
+        <w:gridCol w:w="1728"/>
+        <w:gridCol w:w="1728"/>
+        <w:gridCol w:w="1728"/>
+        <w:gridCol w:w="1728"/>
+        <w:gridCol w:w="1728"/>
+      </w:tblGrid>
+      <w:tr>
+        <w:tc>
+          <w:tcPr>
+            <w:tcW w:type="dxa" w:w="1728"/>
+          </w:tcPr>
+          <w:p>
+            <w:r>
+              <w:rPr>
+                <w:b/>
+              </w:rPr>
+            </w:r>
+            <w:r>
+              <w:rPr>
+                <w:b/>
+              </w:rPr>
+              <w:t>Model</w:t>
+            </w:r>
+          </w:p>
+        </w:tc>
+        <w:tc>
+          <w:tcPr>
+            <w:tcW w:type="dxa" w:w="1728"/>
+          </w:tcPr>
+          <w:p>
+            <w:r>
+              <w:rPr>
+                <w:b/>
+              </w:rPr>
+            </w:r>
+            <w:r>
+              <w:rPr>
+                <w:b/>
+              </w:rPr>
+              <w:t>Horizon</w:t>
+            </w:r>
+          </w:p>
+        </w:tc>
+        <w:tc>
+          <w:tcPr>
+            <w:tcW w:type="dxa" w:w="1728"/>
+          </w:tcPr>
+          <w:p>
+            <w:r>
+              <w:rPr>
+                <w:b/>
+              </w:rPr>
+            </w:r>
+            <w:r>
+              <w:rPr>
+                <w:b/>
+              </w:rPr>
+              <w:t>MSE (mph²)</w:t>
+            </w:r>
+          </w:p>
+        </w:tc>
+        <w:tc>
+          <w:tcPr>
+            <w:tcW w:type="dxa" w:w="1728"/>
+          </w:tcPr>
+          <w:p>
+            <w:r>
+              <w:rPr>
+                <w:b/>
+              </w:rPr>
+            </w:r>
+            <w:r>
+              <w:rPr>
+                <w:b/>
+              </w:rPr>
+              <w:t>MAE (mph)</w:t>
+            </w:r>
+          </w:p>
+        </w:tc>
+        <w:tc>
+          <w:tcPr>
+            <w:tcW w:type="dxa" w:w="1728"/>
+          </w:tcPr>
+          <w:p>
+            <w:r>
+              <w:rPr>
+                <w:b/>
+              </w:rPr>
+            </w:r>
+            <w:r>
+              <w:rPr>
+                <w:b/>
+              </w:rPr>
+              <w:t>MAPE (%)</w:t>
+            </w:r>
+          </w:p>
+        </w:tc>
+      </w:tr>
+      <w:tr>
+        <w:tc>
+          <w:tcPr>
+            <w:tcW w:type="dxa" w:w="1728"/>
+          </w:tcPr>
+          <w:p>
+            <w:r/>
+            <w:r>
+              <w:t>TTS</w:t>
+            </w:r>
+          </w:p>
+        </w:tc>
+        <w:tc>
+          <w:tcPr>
+            <w:tcW w:type="dxa" w:w="1728"/>
+          </w:tcPr>
+          <w:p>
+            <w:r/>
+            <w:r>
+              <w:t>15 min</w:t>
+            </w:r>
+          </w:p>
+        </w:tc>
+        <w:tc>
+          <w:tcPr>
+            <w:tcW w:type="dxa" w:w="1728"/>
+          </w:tcPr>
+          <w:p>
+            <w:r/>
+            <w:r>
+              <w:t>35.191</w:t>
+            </w:r>
+          </w:p>
+        </w:tc>
+        <w:tc>
+          <w:tcPr>
+            <w:tcW w:type="dxa" w:w="1728"/>
+          </w:tcPr>
+          <w:p>
+            <w:r/>
+            <w:r>
+              <w:t>3.066</w:t>
+            </w:r>
+          </w:p>
+        </w:tc>
+        <w:tc>
+          <w:tcPr>
+            <w:tcW w:type="dxa" w:w="1728"/>
+          </w:tcPr>
+          <w:p>
+            <w:r/>
+            <w:r>
+              <w:t>8.22</w:t>
+            </w:r>
+          </w:p>
+        </w:tc>
+      </w:tr>
+      <w:tr>
+        <w:tc>
+          <w:tcPr>
+            <w:tcW w:type="dxa" w:w="1728"/>
+          </w:tcPr>
+          <w:p>
+            <w:r/>
+            <w:r>
+              <w:t>TTS</w:t>
+            </w:r>
+          </w:p>
+        </w:tc>
+        <w:tc>
+          <w:tcPr>
+            <w:tcW w:type="dxa" w:w="1728"/>
+          </w:tcPr>
+          <w:p>
+            <w:r/>
+            <w:r>
+              <w:t>30 min</w:t>
+            </w:r>
+          </w:p>
+        </w:tc>
+        <w:tc>
+          <w:tcPr>
+            <w:tcW w:type="dxa" w:w="1728"/>
+          </w:tcPr>
+          <w:p>
+            <w:r/>
+            <w:r>
+              <w:t>55.003</w:t>
+            </w:r>
+          </w:p>
+        </w:tc>
+        <w:tc>
+          <w:tcPr>
+            <w:tcW w:type="dxa" w:w="1728"/>
+          </w:tcPr>
+          <w:p>
+            <w:r/>
+            <w:r>
+              <w:t>3.703</w:t>
+            </w:r>
+          </w:p>
+        </w:tc>
+        <w:tc>
+          <w:tcPr>
+            <w:tcW w:type="dxa" w:w="1728"/>
+          </w:tcPr>
+          <w:p>
+            <w:r/>
+            <w:r>
+              <w:t>10.42</w:t>
+            </w:r>
+          </w:p>
+        </w:tc>
+      </w:tr>
+      <w:tr>
+        <w:tc>
+          <w:tcPr>
+            <w:tcW w:type="dxa" w:w="1728"/>
+          </w:tcPr>
+          <w:p>
+            <w:r/>
+            <w:r>
+              <w:t>TTS</w:t>
+            </w:r>
+          </w:p>
+        </w:tc>
+        <w:tc>
+          <w:tcPr>
+            <w:tcW w:type="dxa" w:w="1728"/>
+          </w:tcPr>
+          <w:p>
+            <w:r/>
+            <w:r>
+              <w:t>60 min</w:t>
+            </w:r>
+          </w:p>
+        </w:tc>
+        <w:tc>
+          <w:tcPr>
+            <w:tcW w:type="dxa" w:w="1728"/>
+          </w:tcPr>
+          <w:p>
+            <w:r/>
+            <w:r>
+              <w:t>88.201</w:t>
+            </w:r>
+          </w:p>
+        </w:tc>
+        <w:tc>
+          <w:tcPr>
+            <w:tcW w:type="dxa" w:w="1728"/>
+          </w:tcPr>
+          <w:p>
+            <w:r/>
+            <w:r>
+              <w:t>4.738</w:t>
+            </w:r>
+          </w:p>
+        </w:tc>
+        <w:tc>
+          <w:tcPr>
+            <w:tcW w:type="dxa" w:w="1728"/>
+          </w:tcPr>
+          <w:p>
+            <w:r/>
+            <w:r>
+              <w:t>14.03</w:t>
+            </w:r>
+          </w:p>
+        </w:tc>
+      </w:tr>
+    </w:tbl>
+    <w:p>
+      <w:r>
+        <w:drawing>
+          <wp:inline xmlns:a="http://schemas.openxmlformats.org/drawingml/2006/main" xmlns:pic="http://schemas.openxmlformats.org/drawingml/2006/picture">
+            <wp:extent cx="5400000" cy="3857143"/>
+            <wp:docPr id="2" name="Picture 2"/>
+            <wp:cNvGraphicFramePr>
+              <a:graphicFrameLocks noChangeAspect="1"/>
+            </wp:cNvGraphicFramePr>
+            <a:graphic>
+              <a:graphicData uri="http://schemas.openxmlformats.org/drawingml/2006/picture">
+                <pic:pic>
+                  <pic:nvPicPr>
+                    <pic:cNvPr id="0" name="fig04_horizon_trend_mae.png"/>
+                    <pic:cNvPicPr/>
+                  </pic:nvPicPr>
+                  <pic:blipFill>
+                    <a:blip r:embed="rId10"/>
+                    <a:stretch>
+                      <a:fillRect/>
+                    </a:stretch>
+                  </pic:blipFill>
+                  <pic:spPr>
+                    <a:xfrm>
+                      <a:off x="0" y="0"/>
+                      <a:ext cx="5400000" cy="3857143"/>
+                    </a:xfrm>
+                    <a:prstGeom prst="rect"/>
+                  </pic:spPr>
+                </pic:pic>
+              </a:graphicData>
+            </a:graphic>
+          </wp:inline>
+        </w:drawing>
+      </w:r>
+    </w:p>
+    <w:p>
+      <w:pPr>
+        <w:jc w:val="center"/>
+      </w:pPr>
+      <w:r>
+        <w:rPr>
+          <w:i/>
+          <w:sz w:val="18"/>
+        </w:rPr>
+        <w:t>TTS horizon trend</w:t>
+      </w:r>
+    </w:p>
+    <w:p>
+      <w:r>
+        <w:rPr>
+          <w:i/>
+        </w:rPr>
+        <w:t>Figure 2. TTS MAE vs. prediction horizon, averaged over 207 sensors.</w:t>
+      </w:r>
+    </w:p>
+    <w:p>
+      <w:r>
+        <w:rPr>
+          <w:b/>
+        </w:rPr>
+        <w:t>Trend as horizon increases</w:t>
+      </w:r>
+      <w:r>
+        <w:t xml:space="preserve">: all three metrics increase monotonically and substantially from 15 to 60 minutes — MSE roughly </w:t>
+      </w:r>
+      <w:r>
+        <w:rPr>
+          <w:b/>
+        </w:rPr>
+        <w:t>2.5×</w:t>
+      </w:r>
+      <w:r>
+        <w:t xml:space="preserve">, MAE </w:t>
+      </w:r>
+      <w:r>
+        <w:rPr>
+          <w:b/>
+        </w:rPr>
+        <w:t>1.55×</w:t>
+      </w:r>
+      <w:r>
+        <w:t xml:space="preserve">, MAPE </w:t>
+      </w:r>
+      <w:r>
+        <w:rPr>
+          <w:b/>
+        </w:rPr>
+        <w:t>1.7×</w:t>
+      </w:r>
+      <w:r>
+        <w:t xml:space="preserve"> from the shortest to the longest horizon. This is the expected behaviour for any forecasting model: uncertainty compounds the further ahead the prediction reaches, since more unpredictable real-world events (an incident, a signal change, a driver's individual choice) can occur within a longer window, and the model has proportionally less recent information relative to how far ahead it must extrapolate. The </w:t>
+      </w:r>
+      <w:r>
+        <w:rPr>
+          <w:i/>
+        </w:rPr>
+        <w:t>rate</w:t>
+      </w:r>
+      <w:r>
+        <w:t xml:space="preserve"> of growth (MSE growing faster than MAE, consistent with MSE's quadratic penalty on the same underlying error growth) is also as expected.</w:t>
       </w:r>
     </w:p>
     <w:p>
@@ -1228,12 +1812,625 @@
         <w:pStyle w:val="Heading3"/>
       </w:pPr>
       <w:r>
-        <w:t>3.4 Discussion</w:t>
+        <w:t>3.3 Per-Station Analysis</w:t>
       </w:r>
     </w:p>
     <w:p>
       <w:r>
-        <w:t>[PENDING]</w:t>
+        <w:rPr>
+          <w:i/>
+        </w:rPr>
+        <w:t>Table showing sensors 1–3 (`report/tables/per_station.md` has the full table; TTS rows reproduced here):</w:t>
+      </w:r>
+    </w:p>
+    <w:tbl>
+      <w:tblPr>
+        <w:tblStyle w:val="LightGrid-Accent1"/>
+        <w:tblW w:type="auto" w:w="0"/>
+        <w:tblLook w:firstColumn="1" w:firstRow="1" w:lastColumn="0" w:lastRow="0" w:noHBand="0" w:noVBand="1" w:val="04A0"/>
+      </w:tblPr>
+      <w:tblGrid>
+        <w:gridCol w:w="2160"/>
+        <w:gridCol w:w="2160"/>
+        <w:gridCol w:w="2160"/>
+        <w:gridCol w:w="2160"/>
+      </w:tblGrid>
+      <w:tr>
+        <w:tc>
+          <w:tcPr>
+            <w:tcW w:type="dxa" w:w="2160"/>
+          </w:tcPr>
+          <w:p>
+            <w:r>
+              <w:rPr>
+                <w:b/>
+              </w:rPr>
+            </w:r>
+            <w:r>
+              <w:rPr>
+                <w:b/>
+              </w:rPr>
+              <w:t>Sensor</w:t>
+            </w:r>
+          </w:p>
+        </w:tc>
+        <w:tc>
+          <w:tcPr>
+            <w:tcW w:type="dxa" w:w="2160"/>
+          </w:tcPr>
+          <w:p>
+            <w:r>
+              <w:rPr>
+                <w:b/>
+              </w:rPr>
+            </w:r>
+            <w:r>
+              <w:rPr>
+                <w:b/>
+              </w:rPr>
+              <w:t>Horizon</w:t>
+            </w:r>
+          </w:p>
+        </w:tc>
+        <w:tc>
+          <w:tcPr>
+            <w:tcW w:type="dxa" w:w="2160"/>
+          </w:tcPr>
+          <w:p>
+            <w:r>
+              <w:rPr>
+                <w:b/>
+              </w:rPr>
+            </w:r>
+            <w:r>
+              <w:rPr>
+                <w:b/>
+              </w:rPr>
+              <w:t>MAE (mph)</w:t>
+            </w:r>
+          </w:p>
+        </w:tc>
+        <w:tc>
+          <w:tcPr>
+            <w:tcW w:type="dxa" w:w="2160"/>
+          </w:tcPr>
+          <w:p>
+            <w:r>
+              <w:rPr>
+                <w:b/>
+              </w:rPr>
+            </w:r>
+            <w:r>
+              <w:rPr>
+                <w:b/>
+              </w:rPr>
+              <w:t>MAPE (%)</w:t>
+            </w:r>
+          </w:p>
+        </w:tc>
+      </w:tr>
+      <w:tr>
+        <w:tc>
+          <w:tcPr>
+            <w:tcW w:type="dxa" w:w="2160"/>
+          </w:tcPr>
+          <w:p>
+            <w:r/>
+            <w:r>
+              <w:t>Sensor 1</w:t>
+            </w:r>
+          </w:p>
+        </w:tc>
+        <w:tc>
+          <w:tcPr>
+            <w:tcW w:type="dxa" w:w="2160"/>
+          </w:tcPr>
+          <w:p>
+            <w:r/>
+            <w:r>
+              <w:t>15 min</w:t>
+            </w:r>
+          </w:p>
+        </w:tc>
+        <w:tc>
+          <w:tcPr>
+            <w:tcW w:type="dxa" w:w="2160"/>
+          </w:tcPr>
+          <w:p>
+            <w:r/>
+            <w:r>
+              <w:t>2.621</w:t>
+            </w:r>
+          </w:p>
+        </w:tc>
+        <w:tc>
+          <w:tcPr>
+            <w:tcW w:type="dxa" w:w="2160"/>
+          </w:tcPr>
+          <w:p>
+            <w:r/>
+            <w:r>
+              <w:t>7.03</w:t>
+            </w:r>
+          </w:p>
+        </w:tc>
+      </w:tr>
+      <w:tr>
+        <w:tc>
+          <w:tcPr>
+            <w:tcW w:type="dxa" w:w="2160"/>
+          </w:tcPr>
+          <w:p>
+            <w:r/>
+            <w:r>
+              <w:t>Sensor 1</w:t>
+            </w:r>
+          </w:p>
+        </w:tc>
+        <w:tc>
+          <w:tcPr>
+            <w:tcW w:type="dxa" w:w="2160"/>
+          </w:tcPr>
+          <w:p>
+            <w:r/>
+            <w:r>
+              <w:t>30 min</w:t>
+            </w:r>
+          </w:p>
+        </w:tc>
+        <w:tc>
+          <w:tcPr>
+            <w:tcW w:type="dxa" w:w="2160"/>
+          </w:tcPr>
+          <w:p>
+            <w:r/>
+            <w:r>
+              <w:t>3.509</w:t>
+            </w:r>
+          </w:p>
+        </w:tc>
+        <w:tc>
+          <w:tcPr>
+            <w:tcW w:type="dxa" w:w="2160"/>
+          </w:tcPr>
+          <w:p>
+            <w:r/>
+            <w:r>
+              <w:t>10.00</w:t>
+            </w:r>
+          </w:p>
+        </w:tc>
+      </w:tr>
+      <w:tr>
+        <w:tc>
+          <w:tcPr>
+            <w:tcW w:type="dxa" w:w="2160"/>
+          </w:tcPr>
+          <w:p>
+            <w:r/>
+            <w:r>
+              <w:t>Sensor 1</w:t>
+            </w:r>
+          </w:p>
+        </w:tc>
+        <w:tc>
+          <w:tcPr>
+            <w:tcW w:type="dxa" w:w="2160"/>
+          </w:tcPr>
+          <w:p>
+            <w:r/>
+            <w:r>
+              <w:t>60 min</w:t>
+            </w:r>
+          </w:p>
+        </w:tc>
+        <w:tc>
+          <w:tcPr>
+            <w:tcW w:type="dxa" w:w="2160"/>
+          </w:tcPr>
+          <w:p>
+            <w:r/>
+            <w:r>
+              <w:t>5.052</w:t>
+            </w:r>
+          </w:p>
+        </w:tc>
+        <w:tc>
+          <w:tcPr>
+            <w:tcW w:type="dxa" w:w="2160"/>
+          </w:tcPr>
+          <w:p>
+            <w:r/>
+            <w:r>
+              <w:t>15.46</w:t>
+            </w:r>
+          </w:p>
+        </w:tc>
+      </w:tr>
+      <w:tr>
+        <w:tc>
+          <w:tcPr>
+            <w:tcW w:type="dxa" w:w="2160"/>
+          </w:tcPr>
+          <w:p>
+            <w:r/>
+            <w:r>
+              <w:t>Sensor 2</w:t>
+            </w:r>
+          </w:p>
+        </w:tc>
+        <w:tc>
+          <w:tcPr>
+            <w:tcW w:type="dxa" w:w="2160"/>
+          </w:tcPr>
+          <w:p>
+            <w:r/>
+            <w:r>
+              <w:t>15 min</w:t>
+            </w:r>
+          </w:p>
+        </w:tc>
+        <w:tc>
+          <w:tcPr>
+            <w:tcW w:type="dxa" w:w="2160"/>
+          </w:tcPr>
+          <w:p>
+            <w:r/>
+            <w:r>
+              <w:t>1.631</w:t>
+            </w:r>
+          </w:p>
+        </w:tc>
+        <w:tc>
+          <w:tcPr>
+            <w:tcW w:type="dxa" w:w="2160"/>
+          </w:tcPr>
+          <w:p>
+            <w:r/>
+            <w:r>
+              <w:t>2.79</w:t>
+            </w:r>
+          </w:p>
+        </w:tc>
+      </w:tr>
+      <w:tr>
+        <w:tc>
+          <w:tcPr>
+            <w:tcW w:type="dxa" w:w="2160"/>
+          </w:tcPr>
+          <w:p>
+            <w:r/>
+            <w:r>
+              <w:t>Sensor 2</w:t>
+            </w:r>
+          </w:p>
+        </w:tc>
+        <w:tc>
+          <w:tcPr>
+            <w:tcW w:type="dxa" w:w="2160"/>
+          </w:tcPr>
+          <w:p>
+            <w:r/>
+            <w:r>
+              <w:t>30 min</w:t>
+            </w:r>
+          </w:p>
+        </w:tc>
+        <w:tc>
+          <w:tcPr>
+            <w:tcW w:type="dxa" w:w="2160"/>
+          </w:tcPr>
+          <w:p>
+            <w:r/>
+            <w:r>
+              <w:t>1.693</w:t>
+            </w:r>
+          </w:p>
+        </w:tc>
+        <w:tc>
+          <w:tcPr>
+            <w:tcW w:type="dxa" w:w="2160"/>
+          </w:tcPr>
+          <w:p>
+            <w:r/>
+            <w:r>
+              <w:t>2.90</w:t>
+            </w:r>
+          </w:p>
+        </w:tc>
+      </w:tr>
+      <w:tr>
+        <w:tc>
+          <w:tcPr>
+            <w:tcW w:type="dxa" w:w="2160"/>
+          </w:tcPr>
+          <w:p>
+            <w:r/>
+            <w:r>
+              <w:t>Sensor 2</w:t>
+            </w:r>
+          </w:p>
+        </w:tc>
+        <w:tc>
+          <w:tcPr>
+            <w:tcW w:type="dxa" w:w="2160"/>
+          </w:tcPr>
+          <w:p>
+            <w:r/>
+            <w:r>
+              <w:t>60 min</w:t>
+            </w:r>
+          </w:p>
+        </w:tc>
+        <w:tc>
+          <w:tcPr>
+            <w:tcW w:type="dxa" w:w="2160"/>
+          </w:tcPr>
+          <w:p>
+            <w:r/>
+            <w:r>
+              <w:t>1.809</w:t>
+            </w:r>
+          </w:p>
+        </w:tc>
+        <w:tc>
+          <w:tcPr>
+            <w:tcW w:type="dxa" w:w="2160"/>
+          </w:tcPr>
+          <w:p>
+            <w:r/>
+            <w:r>
+              <w:t>3.09</w:t>
+            </w:r>
+          </w:p>
+        </w:tc>
+      </w:tr>
+      <w:tr>
+        <w:tc>
+          <w:tcPr>
+            <w:tcW w:type="dxa" w:w="2160"/>
+          </w:tcPr>
+          <w:p>
+            <w:r/>
+            <w:r>
+              <w:t>Sensor 3</w:t>
+            </w:r>
+          </w:p>
+        </w:tc>
+        <w:tc>
+          <w:tcPr>
+            <w:tcW w:type="dxa" w:w="2160"/>
+          </w:tcPr>
+          <w:p>
+            <w:r/>
+            <w:r>
+              <w:t>15 min</w:t>
+            </w:r>
+          </w:p>
+        </w:tc>
+        <w:tc>
+          <w:tcPr>
+            <w:tcW w:type="dxa" w:w="2160"/>
+          </w:tcPr>
+          <w:p>
+            <w:r/>
+            <w:r>
+              <w:t>2.125</w:t>
+            </w:r>
+          </w:p>
+        </w:tc>
+        <w:tc>
+          <w:tcPr>
+            <w:tcW w:type="dxa" w:w="2160"/>
+          </w:tcPr>
+          <w:p>
+            <w:r/>
+            <w:r>
+              <w:t>4.80</w:t>
+            </w:r>
+          </w:p>
+        </w:tc>
+      </w:tr>
+      <w:tr>
+        <w:tc>
+          <w:tcPr>
+            <w:tcW w:type="dxa" w:w="2160"/>
+          </w:tcPr>
+          <w:p>
+            <w:r/>
+            <w:r>
+              <w:t>Sensor 3</w:t>
+            </w:r>
+          </w:p>
+        </w:tc>
+        <w:tc>
+          <w:tcPr>
+            <w:tcW w:type="dxa" w:w="2160"/>
+          </w:tcPr>
+          <w:p>
+            <w:r/>
+            <w:r>
+              <w:t>30 min</w:t>
+            </w:r>
+          </w:p>
+        </w:tc>
+        <w:tc>
+          <w:tcPr>
+            <w:tcW w:type="dxa" w:w="2160"/>
+          </w:tcPr>
+          <w:p>
+            <w:r/>
+            <w:r>
+              <w:t>2.726</w:t>
+            </w:r>
+          </w:p>
+        </w:tc>
+        <w:tc>
+          <w:tcPr>
+            <w:tcW w:type="dxa" w:w="2160"/>
+          </w:tcPr>
+          <w:p>
+            <w:r/>
+            <w:r>
+              <w:t>6.55</w:t>
+            </w:r>
+          </w:p>
+        </w:tc>
+      </w:tr>
+      <w:tr>
+        <w:tc>
+          <w:tcPr>
+            <w:tcW w:type="dxa" w:w="2160"/>
+          </w:tcPr>
+          <w:p>
+            <w:r/>
+            <w:r>
+              <w:t>Sensor 3</w:t>
+            </w:r>
+          </w:p>
+        </w:tc>
+        <w:tc>
+          <w:tcPr>
+            <w:tcW w:type="dxa" w:w="2160"/>
+          </w:tcPr>
+          <w:p>
+            <w:r/>
+            <w:r>
+              <w:t>60 min</w:t>
+            </w:r>
+          </w:p>
+        </w:tc>
+        <w:tc>
+          <w:tcPr>
+            <w:tcW w:type="dxa" w:w="2160"/>
+          </w:tcPr>
+          <w:p>
+            <w:r/>
+            <w:r>
+              <w:t>3.747</w:t>
+            </w:r>
+          </w:p>
+        </w:tc>
+        <w:tc>
+          <w:tcPr>
+            <w:tcW w:type="dxa" w:w="2160"/>
+          </w:tcPr>
+          <w:p>
+            <w:r/>
+            <w:r>
+              <w:t>9.68</w:t>
+            </w:r>
+          </w:p>
+        </w:tc>
+      </w:tr>
+    </w:tbl>
+    <w:p>
+      <w:r>
+        <w:drawing>
+          <wp:inline xmlns:a="http://schemas.openxmlformats.org/drawingml/2006/main" xmlns:pic="http://schemas.openxmlformats.org/drawingml/2006/picture">
+            <wp:extent cx="5400000" cy="2268000"/>
+            <wp:docPr id="3" name="Picture 3"/>
+            <wp:cNvGraphicFramePr>
+              <a:graphicFrameLocks noChangeAspect="1"/>
+            </wp:cNvGraphicFramePr>
+            <a:graphic>
+              <a:graphicData uri="http://schemas.openxmlformats.org/drawingml/2006/picture">
+                <pic:pic>
+                  <pic:nvPicPr>
+                    <pic:cNvPr id="0" name="fig03_tts_station1_actual_vs_predicted.png"/>
+                    <pic:cNvPicPr/>
+                  </pic:nvPicPr>
+                  <pic:blipFill>
+                    <a:blip r:embed="rId11"/>
+                    <a:stretch>
+                      <a:fillRect/>
+                    </a:stretch>
+                  </pic:blipFill>
+                  <pic:spPr>
+                    <a:xfrm>
+                      <a:off x="0" y="0"/>
+                      <a:ext cx="5400000" cy="2268000"/>
+                    </a:xfrm>
+                    <a:prstGeom prst="rect"/>
+                  </pic:spPr>
+                </pic:pic>
+              </a:graphicData>
+            </a:graphic>
+          </wp:inline>
+        </w:drawing>
+      </w:r>
+    </w:p>
+    <w:p>
+      <w:pPr>
+        <w:jc w:val="center"/>
+      </w:pPr>
+      <w:r>
+        <w:rPr>
+          <w:i/>
+          <w:sz w:val="18"/>
+        </w:rPr>
+        <w:t>TTS actual vs predicted, sensors 1-3</w:t>
+      </w:r>
+    </w:p>
+    <w:p>
+      <w:r>
+        <w:rPr>
+          <w:i/>
+        </w:rPr>
+        <w:t>Figure 3. TTS actual vs. predicted speed at the 60-minute horizon for Sensor 1 (Sensors 2 and 3 in `figures/fig03_tts_station2_actual_vs_predicted.png` and `..._station3...png`), over the first day of the test window.</w:t>
+      </w:r>
+    </w:p>
+    <w:p>
+      <w:r>
+        <w:rPr>
+          <w:b/>
+        </w:rPr>
+        <w:t>How closely predictions follow actuals, and where errors occur</w:t>
+      </w:r>
+      <w:r>
+        <w:t xml:space="preserve">: the three sensors show </w:t>
+      </w:r>
+      <w:r>
+        <w:rPr>
+          <w:b/>
+        </w:rPr>
+        <w:t>materially different difficulty</w:t>
+      </w:r>
+      <w:r>
+        <w:t>, not just noise around a common level. Sensor 2 is easiest across every horizon (MAE 1.63→1.81 mph, MAPE under 3.1% even at 60 min) — its error barely grows with horizon at all, suggesting a road segment with fairly stable, low-variance speed (e.g. free-flowing most of the time, without sharp congestion transitions). Sensor 1 is hardest (MAE 2.62→5.05 mph, MAPE up to 15.5%) and also shows the steepest horizon degradation of the three (nearly doubling from 15 to 60 min) — consistent with a segment that experiences more abrupt speed changes (e.g. congestion onset/clearing) that are inherently harder to extrapolate further into the future. Sensor 3 sits between the two on every metric.</w:t>
+      </w:r>
+    </w:p>
+    <w:p>
+      <w:r>
+        <w:rPr>
+          <w:b/>
+        </w:rPr>
+        <w:t>Do errors increase at longer horizons, and does behaviour differ between sensors?</w:t>
+      </w:r>
+      <w:r>
+        <w:t xml:space="preserve"> Yes to both: every sensor's error grows with horizon (Section 3.2's overall trend holds sensor-by-sensor too), but the </w:t>
+      </w:r>
+      <w:r>
+        <w:rPr>
+          <w:i/>
+        </w:rPr>
+        <w:t>rate</w:t>
+      </w:r>
+      <w:r>
+        <w:t xml:space="preserve"> of growth differs sharply — Sensor 2's near-flat degradation vs. Sensor 1's steep one is itself evidence that per-sensor traffic volatility, not just an intrinsic property of the model, is a major driver of forecast difficulty. This motivates the per-station analyses in Sections 4.5/5.3: a model that handles volatile segments like Sensor 1 better than TTS does would be valuable precisely at the sensors where it currently struggles most.</w:t>
+      </w:r>
+    </w:p>
+    <w:p>
+      <w:pPr>
+        <w:pStyle w:val="Heading3"/>
+      </w:pPr>
+      <w:r>
+        <w:t>3.4 Discussion</w:t>
+      </w:r>
+    </w:p>
+    <w:p>
+      <w:r>
+        <w:t>TTS establishes a working, sane baseline: predictions track the coarse level and diurnal shape of actual speeds (Figure 3), errors grow with horizon in the expected direction and at a plausible magnitude, and per-sensor differences are large enough to be clearly attributable to genuine differences in local traffic dynamics rather than noise. Its main limitation for interpretation here is the 3-epoch training budget (Section 2.5) — validation loss was still decreasing when training stopped, so these numbers likely overstate TTS's true error relative to a fully-converged run, and any comparison against GWN/AGCRN in Section 4/5 (whose own epoch budgets are also constrained, but which use tsl's more expressive default architectures) needs to be read with this caveat rather than treated as a clean, equal-training-budget comparison.</w:t>
       </w:r>
     </w:p>
     <w:p>
@@ -1436,7 +2633,555 @@
     </w:p>
     <w:p>
       <w:r>
-        <w:t>[PENDING — Table 2 + Figure 4]</w:t>
+        <w:rPr>
+          <w:i/>
+        </w:rPr>
+        <w:t xml:space="preserve">Table 2. Overall performance (207-sensor average). GWN (predefined+adaptive) row </w:t>
+      </w:r>
+      <w:r>
+        <w:rPr>
+          <w:i/>
+        </w:rPr>
+        <w:t>[PENDING — training in progress at time of writing]</w:t>
+      </w:r>
+      <w:r>
+        <w:rPr>
+          <w:i/>
+        </w:rPr>
+        <w:t>.</w:t>
+      </w:r>
+    </w:p>
+    <w:tbl>
+      <w:tblPr>
+        <w:tblStyle w:val="LightGrid-Accent1"/>
+        <w:tblW w:type="auto" w:w="0"/>
+        <w:tblLook w:firstColumn="1" w:firstRow="1" w:lastColumn="0" w:lastRow="0" w:noHBand="0" w:noVBand="1" w:val="04A0"/>
+      </w:tblPr>
+      <w:tblGrid>
+        <w:gridCol w:w="1728"/>
+        <w:gridCol w:w="1728"/>
+        <w:gridCol w:w="1728"/>
+        <w:gridCol w:w="1728"/>
+        <w:gridCol w:w="1728"/>
+      </w:tblGrid>
+      <w:tr>
+        <w:tc>
+          <w:tcPr>
+            <w:tcW w:type="dxa" w:w="1728"/>
+          </w:tcPr>
+          <w:p>
+            <w:r>
+              <w:rPr>
+                <w:b/>
+              </w:rPr>
+            </w:r>
+            <w:r>
+              <w:rPr>
+                <w:b/>
+              </w:rPr>
+              <w:t>Model</w:t>
+            </w:r>
+          </w:p>
+        </w:tc>
+        <w:tc>
+          <w:tcPr>
+            <w:tcW w:type="dxa" w:w="1728"/>
+          </w:tcPr>
+          <w:p>
+            <w:r>
+              <w:rPr>
+                <w:b/>
+              </w:rPr>
+            </w:r>
+            <w:r>
+              <w:rPr>
+                <w:b/>
+              </w:rPr>
+              <w:t>Horizon</w:t>
+            </w:r>
+          </w:p>
+        </w:tc>
+        <w:tc>
+          <w:tcPr>
+            <w:tcW w:type="dxa" w:w="1728"/>
+          </w:tcPr>
+          <w:p>
+            <w:r>
+              <w:rPr>
+                <w:b/>
+              </w:rPr>
+            </w:r>
+            <w:r>
+              <w:rPr>
+                <w:b/>
+              </w:rPr>
+              <w:t>MSE (mph²)</w:t>
+            </w:r>
+          </w:p>
+        </w:tc>
+        <w:tc>
+          <w:tcPr>
+            <w:tcW w:type="dxa" w:w="1728"/>
+          </w:tcPr>
+          <w:p>
+            <w:r>
+              <w:rPr>
+                <w:b/>
+              </w:rPr>
+            </w:r>
+            <w:r>
+              <w:rPr>
+                <w:b/>
+              </w:rPr>
+              <w:t>MAE (mph)</w:t>
+            </w:r>
+          </w:p>
+        </w:tc>
+        <w:tc>
+          <w:tcPr>
+            <w:tcW w:type="dxa" w:w="1728"/>
+          </w:tcPr>
+          <w:p>
+            <w:r>
+              <w:rPr>
+                <w:b/>
+              </w:rPr>
+            </w:r>
+            <w:r>
+              <w:rPr>
+                <w:b/>
+              </w:rPr>
+              <w:t>MAPE (%)</w:t>
+            </w:r>
+          </w:p>
+        </w:tc>
+      </w:tr>
+      <w:tr>
+        <w:tc>
+          <w:tcPr>
+            <w:tcW w:type="dxa" w:w="1728"/>
+          </w:tcPr>
+          <w:p>
+            <w:r/>
+            <w:r>
+              <w:t>TTS</w:t>
+            </w:r>
+          </w:p>
+        </w:tc>
+        <w:tc>
+          <w:tcPr>
+            <w:tcW w:type="dxa" w:w="1728"/>
+          </w:tcPr>
+          <w:p>
+            <w:r/>
+            <w:r>
+              <w:t>15 min</w:t>
+            </w:r>
+          </w:p>
+        </w:tc>
+        <w:tc>
+          <w:tcPr>
+            <w:tcW w:type="dxa" w:w="1728"/>
+          </w:tcPr>
+          <w:p>
+            <w:r/>
+            <w:r>
+              <w:t>35.191</w:t>
+            </w:r>
+          </w:p>
+        </w:tc>
+        <w:tc>
+          <w:tcPr>
+            <w:tcW w:type="dxa" w:w="1728"/>
+          </w:tcPr>
+          <w:p>
+            <w:r/>
+            <w:r>
+              <w:t>3.066</w:t>
+            </w:r>
+          </w:p>
+        </w:tc>
+        <w:tc>
+          <w:tcPr>
+            <w:tcW w:type="dxa" w:w="1728"/>
+          </w:tcPr>
+          <w:p>
+            <w:r/>
+            <w:r>
+              <w:t>8.22</w:t>
+            </w:r>
+          </w:p>
+        </w:tc>
+      </w:tr>
+      <w:tr>
+        <w:tc>
+          <w:tcPr>
+            <w:tcW w:type="dxa" w:w="1728"/>
+          </w:tcPr>
+          <w:p>
+            <w:r/>
+            <w:r>
+              <w:t>TTS</w:t>
+            </w:r>
+          </w:p>
+        </w:tc>
+        <w:tc>
+          <w:tcPr>
+            <w:tcW w:type="dxa" w:w="1728"/>
+          </w:tcPr>
+          <w:p>
+            <w:r/>
+            <w:r>
+              <w:t>30 min</w:t>
+            </w:r>
+          </w:p>
+        </w:tc>
+        <w:tc>
+          <w:tcPr>
+            <w:tcW w:type="dxa" w:w="1728"/>
+          </w:tcPr>
+          <w:p>
+            <w:r/>
+            <w:r>
+              <w:t>55.003</w:t>
+            </w:r>
+          </w:p>
+        </w:tc>
+        <w:tc>
+          <w:tcPr>
+            <w:tcW w:type="dxa" w:w="1728"/>
+          </w:tcPr>
+          <w:p>
+            <w:r/>
+            <w:r>
+              <w:t>3.703</w:t>
+            </w:r>
+          </w:p>
+        </w:tc>
+        <w:tc>
+          <w:tcPr>
+            <w:tcW w:type="dxa" w:w="1728"/>
+          </w:tcPr>
+          <w:p>
+            <w:r/>
+            <w:r>
+              <w:t>10.42</w:t>
+            </w:r>
+          </w:p>
+        </w:tc>
+      </w:tr>
+      <w:tr>
+        <w:tc>
+          <w:tcPr>
+            <w:tcW w:type="dxa" w:w="1728"/>
+          </w:tcPr>
+          <w:p>
+            <w:r/>
+            <w:r>
+              <w:t>TTS</w:t>
+            </w:r>
+          </w:p>
+        </w:tc>
+        <w:tc>
+          <w:tcPr>
+            <w:tcW w:type="dxa" w:w="1728"/>
+          </w:tcPr>
+          <w:p>
+            <w:r/>
+            <w:r>
+              <w:t>60 min</w:t>
+            </w:r>
+          </w:p>
+        </w:tc>
+        <w:tc>
+          <w:tcPr>
+            <w:tcW w:type="dxa" w:w="1728"/>
+          </w:tcPr>
+          <w:p>
+            <w:r/>
+            <w:r>
+              <w:t>88.201</w:t>
+            </w:r>
+          </w:p>
+        </w:tc>
+        <w:tc>
+          <w:tcPr>
+            <w:tcW w:type="dxa" w:w="1728"/>
+          </w:tcPr>
+          <w:p>
+            <w:r/>
+            <w:r>
+              <w:t>4.738</w:t>
+            </w:r>
+          </w:p>
+        </w:tc>
+        <w:tc>
+          <w:tcPr>
+            <w:tcW w:type="dxa" w:w="1728"/>
+          </w:tcPr>
+          <w:p>
+            <w:r/>
+            <w:r>
+              <w:t>14.03</w:t>
+            </w:r>
+          </w:p>
+        </w:tc>
+      </w:tr>
+      <w:tr>
+        <w:tc>
+          <w:tcPr>
+            <w:tcW w:type="dxa" w:w="1728"/>
+          </w:tcPr>
+          <w:p>
+            <w:r/>
+            <w:r>
+              <w:t>GWN (predefined)</w:t>
+            </w:r>
+          </w:p>
+        </w:tc>
+        <w:tc>
+          <w:tcPr>
+            <w:tcW w:type="dxa" w:w="1728"/>
+          </w:tcPr>
+          <w:p>
+            <w:r/>
+            <w:r>
+              <w:t>15 min</w:t>
+            </w:r>
+          </w:p>
+        </w:tc>
+        <w:tc>
+          <w:tcPr>
+            <w:tcW w:type="dxa" w:w="1728"/>
+          </w:tcPr>
+          <w:p>
+            <w:r/>
+            <w:r>
+              <w:t>31.338</w:t>
+            </w:r>
+          </w:p>
+        </w:tc>
+        <w:tc>
+          <w:tcPr>
+            <w:tcW w:type="dxa" w:w="1728"/>
+          </w:tcPr>
+          <w:p>
+            <w:r/>
+            <w:r>
+              <w:t>2.973</w:t>
+            </w:r>
+          </w:p>
+        </w:tc>
+        <w:tc>
+          <w:tcPr>
+            <w:tcW w:type="dxa" w:w="1728"/>
+          </w:tcPr>
+          <w:p>
+            <w:r/>
+            <w:r>
+              <w:t>7.53</w:t>
+            </w:r>
+          </w:p>
+        </w:tc>
+      </w:tr>
+      <w:tr>
+        <w:tc>
+          <w:tcPr>
+            <w:tcW w:type="dxa" w:w="1728"/>
+          </w:tcPr>
+          <w:p>
+            <w:r/>
+            <w:r>
+              <w:t>GWN (predefined)</w:t>
+            </w:r>
+          </w:p>
+        </w:tc>
+        <w:tc>
+          <w:tcPr>
+            <w:tcW w:type="dxa" w:w="1728"/>
+          </w:tcPr>
+          <w:p>
+            <w:r/>
+            <w:r>
+              <w:t>30 min</w:t>
+            </w:r>
+          </w:p>
+        </w:tc>
+        <w:tc>
+          <w:tcPr>
+            <w:tcW w:type="dxa" w:w="1728"/>
+          </w:tcPr>
+          <w:p>
+            <w:r/>
+            <w:r>
+              <w:t>47.050</w:t>
+            </w:r>
+          </w:p>
+        </w:tc>
+        <w:tc>
+          <w:tcPr>
+            <w:tcW w:type="dxa" w:w="1728"/>
+          </w:tcPr>
+          <w:p>
+            <w:r/>
+            <w:r>
+              <w:t>3.529</w:t>
+            </w:r>
+          </w:p>
+        </w:tc>
+        <w:tc>
+          <w:tcPr>
+            <w:tcW w:type="dxa" w:w="1728"/>
+          </w:tcPr>
+          <w:p>
+            <w:r/>
+            <w:r>
+              <w:t>9.57</w:t>
+            </w:r>
+          </w:p>
+        </w:tc>
+      </w:tr>
+      <w:tr>
+        <w:tc>
+          <w:tcPr>
+            <w:tcW w:type="dxa" w:w="1728"/>
+          </w:tcPr>
+          <w:p>
+            <w:r/>
+            <w:r>
+              <w:t>GWN (predefined)</w:t>
+            </w:r>
+          </w:p>
+        </w:tc>
+        <w:tc>
+          <w:tcPr>
+            <w:tcW w:type="dxa" w:w="1728"/>
+          </w:tcPr>
+          <w:p>
+            <w:r/>
+            <w:r>
+              <w:t>60 min</w:t>
+            </w:r>
+          </w:p>
+        </w:tc>
+        <w:tc>
+          <w:tcPr>
+            <w:tcW w:type="dxa" w:w="1728"/>
+          </w:tcPr>
+          <w:p>
+            <w:r/>
+            <w:r>
+              <w:t>73.192</w:t>
+            </w:r>
+          </w:p>
+        </w:tc>
+        <w:tc>
+          <w:tcPr>
+            <w:tcW w:type="dxa" w:w="1728"/>
+          </w:tcPr>
+          <w:p>
+            <w:r/>
+            <w:r>
+              <w:t>4.384</w:t>
+            </w:r>
+          </w:p>
+        </w:tc>
+        <w:tc>
+          <w:tcPr>
+            <w:tcW w:type="dxa" w:w="1728"/>
+          </w:tcPr>
+          <w:p>
+            <w:r/>
+            <w:r>
+              <w:t>12.79</w:t>
+            </w:r>
+          </w:p>
+        </w:tc>
+      </w:tr>
+    </w:tbl>
+    <w:p>
+      <w:r>
+        <w:drawing>
+          <wp:inline xmlns:a="http://schemas.openxmlformats.org/drawingml/2006/main" xmlns:pic="http://schemas.openxmlformats.org/drawingml/2006/picture">
+            <wp:extent cx="5400000" cy="3857143"/>
+            <wp:docPr id="4" name="Picture 4"/>
+            <wp:cNvGraphicFramePr>
+              <a:graphicFrameLocks noChangeAspect="1"/>
+            </wp:cNvGraphicFramePr>
+            <a:graphic>
+              <a:graphicData uri="http://schemas.openxmlformats.org/drawingml/2006/picture">
+                <pic:pic>
+                  <pic:nvPicPr>
+                    <pic:cNvPr id="0" name="fig04_horizon_trend_mae.png"/>
+                    <pic:cNvPicPr/>
+                  </pic:nvPicPr>
+                  <pic:blipFill>
+                    <a:blip r:embed="rId10"/>
+                    <a:stretch>
+                      <a:fillRect/>
+                    </a:stretch>
+                  </pic:blipFill>
+                  <pic:spPr>
+                    <a:xfrm>
+                      <a:off x="0" y="0"/>
+                      <a:ext cx="5400000" cy="3857143"/>
+                    </a:xfrm>
+                    <a:prstGeom prst="rect"/>
+                  </pic:spPr>
+                </pic:pic>
+              </a:graphicData>
+            </a:graphic>
+          </wp:inline>
+        </w:drawing>
+      </w:r>
+    </w:p>
+    <w:p>
+      <w:pPr>
+        <w:jc w:val="center"/>
+      </w:pPr>
+      <w:r>
+        <w:rPr>
+          <w:i/>
+          <w:sz w:val="18"/>
+        </w:rPr>
+        <w:t>TTS vs GWN horizon trend</w:t>
+      </w:r>
+    </w:p>
+    <w:p>
+      <w:r>
+        <w:rPr>
+          <w:i/>
+        </w:rPr>
+        <w:t>Figure 4. MAE vs. horizon, TTS vs. GWN (predefined). GWN-adaptive line to be added once its training completes.</w:t>
+      </w:r>
+    </w:p>
+    <w:p>
+      <w:r>
+        <w:rPr>
+          <w:b/>
+        </w:rPr>
+        <w:t>GWN (predefined) beats TTS at every horizon</w:t>
+      </w:r>
+      <w:r>
+        <w:t xml:space="preserve">, on every metric, by a widening margin as the horizon grows: MAE improves by 3.0% at 15 min, 4.7% at 30 min, and 7.5% at 60 min. This is the expected direction — GWN's dilated-convolution temporal stack (8 blocks, receptive field spanning the full 12-step window) and diffusion convolution give it materially more capacity to model both long-range temporal patterns and multi-hop spatial propagation than TTS's single-layer GRU + one-hop </w:t>
+      </w:r>
+      <w:r>
+        <w:rPr>
+          <w:rFonts w:ascii="Courier New" w:hAnsi="Courier New"/>
+        </w:rPr>
+        <w:t>DiffConv</w:t>
+      </w:r>
+      <w:r>
+        <w:t xml:space="preserve">. The </w:t>
+      </w:r>
+      <w:r>
+        <w:rPr>
+          <w:i/>
+        </w:rPr>
+        <w:t>growing</w:t>
+      </w:r>
+      <w:r>
+        <w:t xml:space="preserve"> gap at longer horizons is notable: TTS's simpler temporal encoder appears to compound error faster over the forecast window than GWN's does, consistent with GWN's larger effective receptive field mattering more the further ahead the model must extrapolate. (Caveat: TTS's 3-epoch vs. GWN's 5-epoch training budget, Section 2.5, means this is not a perfectly equal-training-budget comparison — see Section 3.4.)</w:t>
       </w:r>
     </w:p>
     <w:p>
@@ -1449,7 +3194,424 @@
     </w:p>
     <w:p>
       <w:r>
-        <w:t>[PENDING — Table 3 (training time) + Figure 5 (loss curves)]</w:t>
+        <w:rPr>
+          <w:i/>
+        </w:rPr>
+        <w:t xml:space="preserve">Table 3. Training time. TTS's total time is unavailable because that run was deliberately stopped early and evaluated from checkpoint rather than finishing normally (Section 2.5) — its real per-epoch times (232s, 491s, 495s) are still known, just not summed into a "total". GWN (predefined+adaptive) row </w:t>
+      </w:r>
+      <w:r>
+        <w:rPr>
+          <w:i/>
+        </w:rPr>
+        <w:t>[PENDING]</w:t>
+      </w:r>
+      <w:r>
+        <w:rPr>
+          <w:i/>
+        </w:rPr>
+        <w:t>.</w:t>
+      </w:r>
+    </w:p>
+    <w:tbl>
+      <w:tblPr>
+        <w:tblStyle w:val="LightGrid-Accent1"/>
+        <w:tblW w:type="auto" w:w="0"/>
+        <w:tblLook w:firstColumn="1" w:firstRow="1" w:lastColumn="0" w:lastRow="0" w:noHBand="0" w:noVBand="1" w:val="04A0"/>
+      </w:tblPr>
+      <w:tblGrid>
+        <w:gridCol w:w="1440"/>
+        <w:gridCol w:w="1440"/>
+        <w:gridCol w:w="1440"/>
+        <w:gridCol w:w="1440"/>
+        <w:gridCol w:w="1440"/>
+        <w:gridCol w:w="1440"/>
+      </w:tblGrid>
+      <w:tr>
+        <w:tc>
+          <w:tcPr>
+            <w:tcW w:type="dxa" w:w="1440"/>
+          </w:tcPr>
+          <w:p>
+            <w:r>
+              <w:rPr>
+                <w:b/>
+              </w:rPr>
+            </w:r>
+            <w:r>
+              <w:rPr>
+                <w:b/>
+              </w:rPr>
+              <w:t>Model</w:t>
+            </w:r>
+          </w:p>
+        </w:tc>
+        <w:tc>
+          <w:tcPr>
+            <w:tcW w:type="dxa" w:w="1440"/>
+          </w:tcPr>
+          <w:p>
+            <w:r>
+              <w:rPr>
+                <w:b/>
+              </w:rPr>
+            </w:r>
+            <w:r>
+              <w:rPr>
+                <w:b/>
+              </w:rPr>
+              <w:t>Epochs run</w:t>
+            </w:r>
+          </w:p>
+        </w:tc>
+        <w:tc>
+          <w:tcPr>
+            <w:tcW w:type="dxa" w:w="1440"/>
+          </w:tcPr>
+          <w:p>
+            <w:r>
+              <w:rPr>
+                <w:b/>
+              </w:rPr>
+            </w:r>
+            <w:r>
+              <w:rPr>
+                <w:b/>
+              </w:rPr>
+              <w:t>Early stopped</w:t>
+            </w:r>
+          </w:p>
+        </w:tc>
+        <w:tc>
+          <w:tcPr>
+            <w:tcW w:type="dxa" w:w="1440"/>
+          </w:tcPr>
+          <w:p>
+            <w:r>
+              <w:rPr>
+                <w:b/>
+              </w:rPr>
+            </w:r>
+            <w:r>
+              <w:rPr>
+                <w:b/>
+              </w:rPr>
+              <w:t>Total time (min)</w:t>
+            </w:r>
+          </w:p>
+        </w:tc>
+        <w:tc>
+          <w:tcPr>
+            <w:tcW w:type="dxa" w:w="1440"/>
+          </w:tcPr>
+          <w:p>
+            <w:r>
+              <w:rPr>
+                <w:b/>
+              </w:rPr>
+            </w:r>
+            <w:r>
+              <w:rPr>
+                <w:b/>
+              </w:rPr>
+              <w:t>Avg s/epoch</w:t>
+            </w:r>
+          </w:p>
+        </w:tc>
+        <w:tc>
+          <w:tcPr>
+            <w:tcW w:type="dxa" w:w="1440"/>
+          </w:tcPr>
+          <w:p>
+            <w:r>
+              <w:rPr>
+                <w:b/>
+              </w:rPr>
+            </w:r>
+            <w:r>
+              <w:rPr>
+                <w:b/>
+              </w:rPr>
+              <w:t>Best val MAE</w:t>
+            </w:r>
+          </w:p>
+        </w:tc>
+      </w:tr>
+      <w:tr>
+        <w:tc>
+          <w:tcPr>
+            <w:tcW w:type="dxa" w:w="1440"/>
+          </w:tcPr>
+          <w:p>
+            <w:r/>
+            <w:r>
+              <w:t>TTS</w:t>
+            </w:r>
+          </w:p>
+        </w:tc>
+        <w:tc>
+          <w:tcPr>
+            <w:tcW w:type="dxa" w:w="1440"/>
+          </w:tcPr>
+          <w:p>
+            <w:r/>
+            <w:r>
+              <w:t>3 (of 60 planned)</w:t>
+            </w:r>
+          </w:p>
+        </w:tc>
+        <w:tc>
+          <w:tcPr>
+            <w:tcW w:type="dxa" w:w="1440"/>
+          </w:tcPr>
+          <w:p>
+            <w:r/>
+            <w:r>
+              <w:t>N/A (stopped manually)</w:t>
+            </w:r>
+          </w:p>
+        </w:tc>
+        <w:tc>
+          <w:tcPr>
+            <w:tcW w:type="dxa" w:w="1440"/>
+          </w:tcPr>
+          <w:p>
+            <w:r/>
+            <w:r>
+              <w:t>N/A</w:t>
+            </w:r>
+          </w:p>
+        </w:tc>
+        <w:tc>
+          <w:tcPr>
+            <w:tcW w:type="dxa" w:w="1440"/>
+          </w:tcPr>
+          <w:p>
+            <w:r/>
+            <w:r>
+              <w:t>~400 (avg of 3 real epochs)</w:t>
+            </w:r>
+          </w:p>
+        </w:tc>
+        <w:tc>
+          <w:tcPr>
+            <w:tcW w:type="dxa" w:w="1440"/>
+          </w:tcPr>
+          <w:p>
+            <w:r/>
+            <w:r>
+              <w:t>3.077</w:t>
+            </w:r>
+          </w:p>
+        </w:tc>
+      </w:tr>
+      <w:tr>
+        <w:tc>
+          <w:tcPr>
+            <w:tcW w:type="dxa" w:w="1440"/>
+          </w:tcPr>
+          <w:p>
+            <w:r/>
+            <w:r>
+              <w:t>GWN (predefined)</w:t>
+            </w:r>
+          </w:p>
+        </w:tc>
+        <w:tc>
+          <w:tcPr>
+            <w:tcW w:type="dxa" w:w="1440"/>
+          </w:tcPr>
+          <w:p>
+            <w:r/>
+            <w:r>
+              <w:t>5 (4 configured + 1, see note)</w:t>
+            </w:r>
+          </w:p>
+        </w:tc>
+        <w:tc>
+          <w:tcPr>
+            <w:tcW w:type="dxa" w:w="1440"/>
+          </w:tcPr>
+          <w:p>
+            <w:r/>
+            <w:r>
+              <w:t>No (hit max_epochs ceiling)</w:t>
+            </w:r>
+          </w:p>
+        </w:tc>
+        <w:tc>
+          <w:tcPr>
+            <w:tcW w:type="dxa" w:w="1440"/>
+          </w:tcPr>
+          <w:p>
+            <w:r/>
+            <w:r>
+              <w:t>308.4</w:t>
+            </w:r>
+          </w:p>
+        </w:tc>
+        <w:tc>
+          <w:tcPr>
+            <w:tcW w:type="dxa" w:w="1440"/>
+          </w:tcPr>
+          <w:p>
+            <w:r/>
+            <w:r>
+              <w:t>3700.9</w:t>
+            </w:r>
+          </w:p>
+        </w:tc>
+        <w:tc>
+          <w:tcPr>
+            <w:tcW w:type="dxa" w:w="1440"/>
+          </w:tcPr>
+          <w:p>
+            <w:r/>
+            <w:r>
+              <w:t>2.936</w:t>
+            </w:r>
+          </w:p>
+        </w:tc>
+      </w:tr>
+    </w:tbl>
+    <w:p>
+      <w:r>
+        <w:rPr>
+          <w:i/>
+        </w:rPr>
+        <w:t>Note on GWN's epoch count: `max_epochs=4` was configured; the trainer's own epoch-completion log reports 5 due to an off-by-one in how the final "epochs run" milestone is computed (`current_epoch + 1` evaluated one increment late) — 4 real training epochs (indices 0-3) were actually run, matching the 4 rows of per-epoch data in `logs/gwn_predefined/version_</w:t>
+      </w:r>
+      <w:r>
+        <w:t>/metrics.csv`. Reported here as observed rather than silently corrected, since the underlying per-epoch data is what matters and is unambiguous.*</w:t>
+      </w:r>
+    </w:p>
+    <w:p>
+      <w:r>
+        <w:drawing>
+          <wp:inline xmlns:a="http://schemas.openxmlformats.org/drawingml/2006/main" xmlns:pic="http://schemas.openxmlformats.org/drawingml/2006/picture">
+            <wp:extent cx="5400000" cy="3303529"/>
+            <wp:docPr id="5" name="Picture 5"/>
+            <wp:cNvGraphicFramePr>
+              <a:graphicFrameLocks noChangeAspect="1"/>
+            </wp:cNvGraphicFramePr>
+            <a:graphic>
+              <a:graphicData uri="http://schemas.openxmlformats.org/drawingml/2006/picture">
+                <pic:pic>
+                  <pic:nvPicPr>
+                    <pic:cNvPr id="0" name="fig05_convergence_curves.png"/>
+                    <pic:cNvPicPr/>
+                  </pic:nvPicPr>
+                  <pic:blipFill>
+                    <a:blip r:embed="rId12"/>
+                    <a:stretch>
+                      <a:fillRect/>
+                    </a:stretch>
+                  </pic:blipFill>
+                  <pic:spPr>
+                    <a:xfrm>
+                      <a:off x="0" y="0"/>
+                      <a:ext cx="5400000" cy="3303529"/>
+                    </a:xfrm>
+                    <a:prstGeom prst="rect"/>
+                  </pic:spPr>
+                </pic:pic>
+              </a:graphicData>
+            </a:graphic>
+          </wp:inline>
+        </w:drawing>
+      </w:r>
+    </w:p>
+    <w:p>
+      <w:pPr>
+        <w:jc w:val="center"/>
+      </w:pPr>
+      <w:r>
+        <w:rPr>
+          <w:i/>
+          <w:sz w:val="18"/>
+        </w:rPr>
+        <w:t>Convergence curves</w:t>
+      </w:r>
+    </w:p>
+    <w:p>
+      <w:r>
+        <w:rPr>
+          <w:i/>
+        </w:rPr>
+        <w:t>Figure 5. Training (dashed) and validation (solid) loss per epoch, TTS vs. GWN (predefined). GWN-adaptive curve to be added once available.</w:t>
+      </w:r>
+    </w:p>
+    <w:p>
+      <w:r>
+        <w:rPr>
+          <w:b/>
+        </w:rPr>
+        <w:t>GWN's convergence behaviour</w:t>
+      </w:r>
+      <w:r>
+        <w:t xml:space="preserve">: validation MAE decreased for 3 straight epochs (3.162 → 3.019 → 2.936) then </w:t>
+      </w:r>
+      <w:r>
+        <w:rPr>
+          <w:b/>
+        </w:rPr>
+        <w:t>increased</w:t>
+      </w:r>
+      <w:r>
+        <w:t xml:space="preserve"> slightly on epoch 4 (2.951) — the best checkpoint (epoch 2, val_mae=2.936) is what all reported GWN-predefined numbers use. This uptick, right as the deadline-driven </w:t>
+      </w:r>
+      <w:r>
+        <w:rPr>
+          <w:rFonts w:ascii="Courier New" w:hAnsi="Courier New"/>
+        </w:rPr>
+        <w:t>max_epochs=4</w:t>
+      </w:r>
+      <w:r>
+        <w:t xml:space="preserve"> ceiling was reached, is the first concrete sign of </w:t>
+      </w:r>
+      <w:r>
+        <w:rPr>
+          <w:b/>
+        </w:rPr>
+        <w:t>overfitting</w:t>
+      </w:r>
+      <w:r>
+        <w:t xml:space="preserve"> starting (training loss kept falling every epoch while validation loss turned back up) rather than the run being cut off mid- improvement — some evidence </w:t>
+      </w:r>
+      <w:r>
+        <w:rPr>
+          <w:i/>
+        </w:rPr>
+        <w:t>against</w:t>
+      </w:r>
+      <w:r>
+        <w:t xml:space="preserve"> the Section 4.4 hypothesis that GWN's whole gap to the original paper is purely a "needed more epochs" story, though 4 epochs is still very short by GPU-scale-training standards and the picture may look different with GWN-adaptive's curve for comparison. </w:t>
+      </w:r>
+      <w:r>
+        <w:rPr>
+          <w:b/>
+        </w:rPr>
+        <w:t>TTS</w:t>
+      </w:r>
+      <w:r>
+        <w:t xml:space="preserve">, by contrast, was still improving at every one of its 3 epochs when stopped (3.147 → 3.108 → 3.077) with no sign of plateauing — its numbers likely </w:t>
+      </w:r>
+      <w:r>
+        <w:rPr>
+          <w:i/>
+        </w:rPr>
+        <w:t>do</w:t>
+      </w:r>
+      <w:r>
+        <w:t xml:space="preserve"> understate its true converged performance, unlike GWN's. GWN's per-epoch cost (~62 min average) is roughly </w:t>
+      </w:r>
+      <w:r>
+        <w:rPr>
+          <w:b/>
+        </w:rPr>
+        <w:t>9x</w:t>
+      </w:r>
+      <w:r>
+        <w:t xml:space="preserve"> TTS's (~7 min average, from its 3 real epoch times) on this hardware, consistent with the Section 2.5 timing pilot.</w:t>
       </w:r>
     </w:p>
     <w:p>
@@ -1768,7 +3930,7 @@
     </w:p>
     <w:p>
       <w:r>
-        <w:t xml:space="preserve">as many epochs as needed to converge; this report's GWN runs are capped at 6 epochs each (Section 2.5) specifically because of a CPU-only, deadline-constrained environment. Any accuracy gap where this report's GWN underperforms the published numbers is a strong candidate to be explained primarily by this training-budget gap rather than by an implementation difference — this is stated as the working hypothesis, to be checked against the actual convergence curves (Section 4.3) once training completes: a model whose validation loss is still visibly decreasing when training stops is evidence </w:t>
+        <w:t xml:space="preserve">as many epochs as needed to converge; this report's GWN runs are capped at 4 epochs each (Section 2.5) specifically because of a CPU-only, deadline-constrained environment. Any accuracy gap where this report's GWN underperforms the published numbers is a strong candidate to be explained primarily by this training-budget gap rather than by an implementation difference — this is stated as the working hypothesis, to be checked against the actual convergence curves (Section 4.3) once training completes: a model whose validation loss is still visibly decreasing when training stops is evidence </w:t>
       </w:r>
       <w:r>
         <w:rPr>
@@ -1867,7 +4029,735 @@
     </w:p>
     <w:p>
       <w:r>
-        <w:t>[PENDING — Figure 6, Table 4]</w:t>
+        <w:rPr>
+          <w:i/>
+        </w:rPr>
+        <w:t xml:space="preserve">Table 4. Sensors 1-3, TTS vs. GWN (predefined). GWN-adaptive columns </w:t>
+      </w:r>
+      <w:r>
+        <w:rPr>
+          <w:i/>
+        </w:rPr>
+        <w:t>[PENDING]</w:t>
+      </w:r>
+      <w:r>
+        <w:rPr>
+          <w:i/>
+        </w:rPr>
+        <w:t>.</w:t>
+      </w:r>
+    </w:p>
+    <w:tbl>
+      <w:tblPr>
+        <w:tblStyle w:val="LightGrid-Accent1"/>
+        <w:tblW w:type="auto" w:w="0"/>
+        <w:tblLook w:firstColumn="1" w:firstRow="1" w:lastColumn="0" w:lastRow="0" w:noHBand="0" w:noVBand="1" w:val="04A0"/>
+      </w:tblPr>
+      <w:tblGrid>
+        <w:gridCol w:w="1728"/>
+        <w:gridCol w:w="1728"/>
+        <w:gridCol w:w="1728"/>
+        <w:gridCol w:w="1728"/>
+        <w:gridCol w:w="1728"/>
+      </w:tblGrid>
+      <w:tr>
+        <w:tc>
+          <w:tcPr>
+            <w:tcW w:type="dxa" w:w="1728"/>
+          </w:tcPr>
+          <w:p>
+            <w:r>
+              <w:rPr>
+                <w:b/>
+              </w:rPr>
+            </w:r>
+            <w:r>
+              <w:rPr>
+                <w:b/>
+              </w:rPr>
+              <w:t>Sensor</w:t>
+            </w:r>
+          </w:p>
+        </w:tc>
+        <w:tc>
+          <w:tcPr>
+            <w:tcW w:type="dxa" w:w="1728"/>
+          </w:tcPr>
+          <w:p>
+            <w:r>
+              <w:rPr>
+                <w:b/>
+              </w:rPr>
+            </w:r>
+            <w:r>
+              <w:rPr>
+                <w:b/>
+              </w:rPr>
+              <w:t>Horizon</w:t>
+            </w:r>
+          </w:p>
+        </w:tc>
+        <w:tc>
+          <w:tcPr>
+            <w:tcW w:type="dxa" w:w="1728"/>
+          </w:tcPr>
+          <w:p>
+            <w:r>
+              <w:rPr>
+                <w:b/>
+              </w:rPr>
+            </w:r>
+            <w:r>
+              <w:rPr>
+                <w:b/>
+              </w:rPr>
+              <w:t>TTS MAE</w:t>
+            </w:r>
+          </w:p>
+        </w:tc>
+        <w:tc>
+          <w:tcPr>
+            <w:tcW w:type="dxa" w:w="1728"/>
+          </w:tcPr>
+          <w:p>
+            <w:r>
+              <w:rPr>
+                <w:b/>
+              </w:rPr>
+            </w:r>
+            <w:r>
+              <w:rPr>
+                <w:b/>
+              </w:rPr>
+              <w:t>GWN (pre) MAE</w:t>
+            </w:r>
+          </w:p>
+        </w:tc>
+        <w:tc>
+          <w:tcPr>
+            <w:tcW w:type="dxa" w:w="1728"/>
+          </w:tcPr>
+          <w:p>
+            <w:r>
+              <w:rPr>
+                <w:b/>
+              </w:rPr>
+            </w:r>
+            <w:r>
+              <w:rPr>
+                <w:b/>
+              </w:rPr>
+              <w:t>Δ (TTS − GWN)</w:t>
+            </w:r>
+          </w:p>
+        </w:tc>
+      </w:tr>
+      <w:tr>
+        <w:tc>
+          <w:tcPr>
+            <w:tcW w:type="dxa" w:w="1728"/>
+          </w:tcPr>
+          <w:p>
+            <w:r/>
+            <w:r>
+              <w:t>Sensor 1</w:t>
+            </w:r>
+          </w:p>
+        </w:tc>
+        <w:tc>
+          <w:tcPr>
+            <w:tcW w:type="dxa" w:w="1728"/>
+          </w:tcPr>
+          <w:p>
+            <w:r/>
+            <w:r>
+              <w:t>15 min</w:t>
+            </w:r>
+          </w:p>
+        </w:tc>
+        <w:tc>
+          <w:tcPr>
+            <w:tcW w:type="dxa" w:w="1728"/>
+          </w:tcPr>
+          <w:p>
+            <w:r/>
+            <w:r>
+              <w:t>2.621</w:t>
+            </w:r>
+          </w:p>
+        </w:tc>
+        <w:tc>
+          <w:tcPr>
+            <w:tcW w:type="dxa" w:w="1728"/>
+          </w:tcPr>
+          <w:p>
+            <w:r/>
+            <w:r>
+              <w:t>2.360</w:t>
+            </w:r>
+          </w:p>
+        </w:tc>
+        <w:tc>
+          <w:tcPr>
+            <w:tcW w:type="dxa" w:w="1728"/>
+          </w:tcPr>
+          <w:p>
+            <w:r/>
+            <w:r>
+              <w:t>+0.261</w:t>
+            </w:r>
+          </w:p>
+        </w:tc>
+      </w:tr>
+      <w:tr>
+        <w:tc>
+          <w:tcPr>
+            <w:tcW w:type="dxa" w:w="1728"/>
+          </w:tcPr>
+          <w:p>
+            <w:r/>
+            <w:r>
+              <w:t>Sensor 1</w:t>
+            </w:r>
+          </w:p>
+        </w:tc>
+        <w:tc>
+          <w:tcPr>
+            <w:tcW w:type="dxa" w:w="1728"/>
+          </w:tcPr>
+          <w:p>
+            <w:r/>
+            <w:r>
+              <w:t>30 min</w:t>
+            </w:r>
+          </w:p>
+        </w:tc>
+        <w:tc>
+          <w:tcPr>
+            <w:tcW w:type="dxa" w:w="1728"/>
+          </w:tcPr>
+          <w:p>
+            <w:r/>
+            <w:r>
+              <w:t>3.509</w:t>
+            </w:r>
+          </w:p>
+        </w:tc>
+        <w:tc>
+          <w:tcPr>
+            <w:tcW w:type="dxa" w:w="1728"/>
+          </w:tcPr>
+          <w:p>
+            <w:r/>
+            <w:r>
+              <w:t>2.901</w:t>
+            </w:r>
+          </w:p>
+        </w:tc>
+        <w:tc>
+          <w:tcPr>
+            <w:tcW w:type="dxa" w:w="1728"/>
+          </w:tcPr>
+          <w:p>
+            <w:r/>
+            <w:r>
+              <w:t>+0.608</w:t>
+            </w:r>
+          </w:p>
+        </w:tc>
+      </w:tr>
+      <w:tr>
+        <w:tc>
+          <w:tcPr>
+            <w:tcW w:type="dxa" w:w="1728"/>
+          </w:tcPr>
+          <w:p>
+            <w:r/>
+            <w:r>
+              <w:t>Sensor 1</w:t>
+            </w:r>
+          </w:p>
+        </w:tc>
+        <w:tc>
+          <w:tcPr>
+            <w:tcW w:type="dxa" w:w="1728"/>
+          </w:tcPr>
+          <w:p>
+            <w:r/>
+            <w:r>
+              <w:t>60 min</w:t>
+            </w:r>
+          </w:p>
+        </w:tc>
+        <w:tc>
+          <w:tcPr>
+            <w:tcW w:type="dxa" w:w="1728"/>
+          </w:tcPr>
+          <w:p>
+            <w:r/>
+            <w:r>
+              <w:t>5.052</w:t>
+            </w:r>
+          </w:p>
+        </w:tc>
+        <w:tc>
+          <w:tcPr>
+            <w:tcW w:type="dxa" w:w="1728"/>
+          </w:tcPr>
+          <w:p>
+            <w:r/>
+            <w:r>
+              <w:t>3.686</w:t>
+            </w:r>
+          </w:p>
+        </w:tc>
+        <w:tc>
+          <w:tcPr>
+            <w:tcW w:type="dxa" w:w="1728"/>
+          </w:tcPr>
+          <w:p>
+            <w:r/>
+            <w:r>
+              <w:t>+1.366</w:t>
+            </w:r>
+          </w:p>
+        </w:tc>
+      </w:tr>
+      <w:tr>
+        <w:tc>
+          <w:tcPr>
+            <w:tcW w:type="dxa" w:w="1728"/>
+          </w:tcPr>
+          <w:p>
+            <w:r/>
+            <w:r>
+              <w:t>Sensor 2</w:t>
+            </w:r>
+          </w:p>
+        </w:tc>
+        <w:tc>
+          <w:tcPr>
+            <w:tcW w:type="dxa" w:w="1728"/>
+          </w:tcPr>
+          <w:p>
+            <w:r/>
+            <w:r>
+              <w:t>15 min</w:t>
+            </w:r>
+          </w:p>
+        </w:tc>
+        <w:tc>
+          <w:tcPr>
+            <w:tcW w:type="dxa" w:w="1728"/>
+          </w:tcPr>
+          <w:p>
+            <w:r/>
+            <w:r>
+              <w:t>1.631</w:t>
+            </w:r>
+          </w:p>
+        </w:tc>
+        <w:tc>
+          <w:tcPr>
+            <w:tcW w:type="dxa" w:w="1728"/>
+          </w:tcPr>
+          <w:p>
+            <w:r/>
+            <w:r>
+              <w:t>1.656</w:t>
+            </w:r>
+          </w:p>
+        </w:tc>
+        <w:tc>
+          <w:tcPr>
+            <w:tcW w:type="dxa" w:w="1728"/>
+          </w:tcPr>
+          <w:p>
+            <w:r/>
+            <w:r>
+              <w:rPr>
+                <w:b/>
+              </w:rPr>
+              <w:t>−0.025</w:t>
+            </w:r>
+          </w:p>
+        </w:tc>
+      </w:tr>
+      <w:tr>
+        <w:tc>
+          <w:tcPr>
+            <w:tcW w:type="dxa" w:w="1728"/>
+          </w:tcPr>
+          <w:p>
+            <w:r/>
+            <w:r>
+              <w:t>Sensor 2</w:t>
+            </w:r>
+          </w:p>
+        </w:tc>
+        <w:tc>
+          <w:tcPr>
+            <w:tcW w:type="dxa" w:w="1728"/>
+          </w:tcPr>
+          <w:p>
+            <w:r/>
+            <w:r>
+              <w:t>30 min</w:t>
+            </w:r>
+          </w:p>
+        </w:tc>
+        <w:tc>
+          <w:tcPr>
+            <w:tcW w:type="dxa" w:w="1728"/>
+          </w:tcPr>
+          <w:p>
+            <w:r/>
+            <w:r>
+              <w:t>1.693</w:t>
+            </w:r>
+          </w:p>
+        </w:tc>
+        <w:tc>
+          <w:tcPr>
+            <w:tcW w:type="dxa" w:w="1728"/>
+          </w:tcPr>
+          <w:p>
+            <w:r/>
+            <w:r>
+              <w:t>1.723</w:t>
+            </w:r>
+          </w:p>
+        </w:tc>
+        <w:tc>
+          <w:tcPr>
+            <w:tcW w:type="dxa" w:w="1728"/>
+          </w:tcPr>
+          <w:p>
+            <w:r/>
+            <w:r>
+              <w:rPr>
+                <w:b/>
+              </w:rPr>
+              <w:t>−0.030</w:t>
+            </w:r>
+          </w:p>
+        </w:tc>
+      </w:tr>
+      <w:tr>
+        <w:tc>
+          <w:tcPr>
+            <w:tcW w:type="dxa" w:w="1728"/>
+          </w:tcPr>
+          <w:p>
+            <w:r/>
+            <w:r>
+              <w:t>Sensor 2</w:t>
+            </w:r>
+          </w:p>
+        </w:tc>
+        <w:tc>
+          <w:tcPr>
+            <w:tcW w:type="dxa" w:w="1728"/>
+          </w:tcPr>
+          <w:p>
+            <w:r/>
+            <w:r>
+              <w:t>60 min</w:t>
+            </w:r>
+          </w:p>
+        </w:tc>
+        <w:tc>
+          <w:tcPr>
+            <w:tcW w:type="dxa" w:w="1728"/>
+          </w:tcPr>
+          <w:p>
+            <w:r/>
+            <w:r>
+              <w:t>1.809</w:t>
+            </w:r>
+          </w:p>
+        </w:tc>
+        <w:tc>
+          <w:tcPr>
+            <w:tcW w:type="dxa" w:w="1728"/>
+          </w:tcPr>
+          <w:p>
+            <w:r/>
+            <w:r>
+              <w:t>1.846</w:t>
+            </w:r>
+          </w:p>
+        </w:tc>
+        <w:tc>
+          <w:tcPr>
+            <w:tcW w:type="dxa" w:w="1728"/>
+          </w:tcPr>
+          <w:p>
+            <w:r/>
+            <w:r>
+              <w:rPr>
+                <w:b/>
+              </w:rPr>
+              <w:t>−0.037</w:t>
+            </w:r>
+          </w:p>
+        </w:tc>
+      </w:tr>
+      <w:tr>
+        <w:tc>
+          <w:tcPr>
+            <w:tcW w:type="dxa" w:w="1728"/>
+          </w:tcPr>
+          <w:p>
+            <w:r/>
+            <w:r>
+              <w:t>Sensor 3</w:t>
+            </w:r>
+          </w:p>
+        </w:tc>
+        <w:tc>
+          <w:tcPr>
+            <w:tcW w:type="dxa" w:w="1728"/>
+          </w:tcPr>
+          <w:p>
+            <w:r/>
+            <w:r>
+              <w:t>15 min</w:t>
+            </w:r>
+          </w:p>
+        </w:tc>
+        <w:tc>
+          <w:tcPr>
+            <w:tcW w:type="dxa" w:w="1728"/>
+          </w:tcPr>
+          <w:p>
+            <w:r/>
+            <w:r>
+              <w:t>2.125</w:t>
+            </w:r>
+          </w:p>
+        </w:tc>
+        <w:tc>
+          <w:tcPr>
+            <w:tcW w:type="dxa" w:w="1728"/>
+          </w:tcPr>
+          <w:p>
+            <w:r/>
+            <w:r>
+              <w:t>2.074</w:t>
+            </w:r>
+          </w:p>
+        </w:tc>
+        <w:tc>
+          <w:tcPr>
+            <w:tcW w:type="dxa" w:w="1728"/>
+          </w:tcPr>
+          <w:p>
+            <w:r/>
+            <w:r>
+              <w:t>+0.051</w:t>
+            </w:r>
+          </w:p>
+        </w:tc>
+      </w:tr>
+      <w:tr>
+        <w:tc>
+          <w:tcPr>
+            <w:tcW w:type="dxa" w:w="1728"/>
+          </w:tcPr>
+          <w:p>
+            <w:r/>
+            <w:r>
+              <w:t>Sensor 3</w:t>
+            </w:r>
+          </w:p>
+        </w:tc>
+        <w:tc>
+          <w:tcPr>
+            <w:tcW w:type="dxa" w:w="1728"/>
+          </w:tcPr>
+          <w:p>
+            <w:r/>
+            <w:r>
+              <w:t>30 min</w:t>
+            </w:r>
+          </w:p>
+        </w:tc>
+        <w:tc>
+          <w:tcPr>
+            <w:tcW w:type="dxa" w:w="1728"/>
+          </w:tcPr>
+          <w:p>
+            <w:r/>
+            <w:r>
+              <w:t>2.726</w:t>
+            </w:r>
+          </w:p>
+        </w:tc>
+        <w:tc>
+          <w:tcPr>
+            <w:tcW w:type="dxa" w:w="1728"/>
+          </w:tcPr>
+          <w:p>
+            <w:r/>
+            <w:r>
+              <w:t>2.562</w:t>
+            </w:r>
+          </w:p>
+        </w:tc>
+        <w:tc>
+          <w:tcPr>
+            <w:tcW w:type="dxa" w:w="1728"/>
+          </w:tcPr>
+          <w:p>
+            <w:r/>
+            <w:r>
+              <w:t>+0.164</w:t>
+            </w:r>
+          </w:p>
+        </w:tc>
+      </w:tr>
+      <w:tr>
+        <w:tc>
+          <w:tcPr>
+            <w:tcW w:type="dxa" w:w="1728"/>
+          </w:tcPr>
+          <w:p>
+            <w:r/>
+            <w:r>
+              <w:t>Sensor 3</w:t>
+            </w:r>
+          </w:p>
+        </w:tc>
+        <w:tc>
+          <w:tcPr>
+            <w:tcW w:type="dxa" w:w="1728"/>
+          </w:tcPr>
+          <w:p>
+            <w:r/>
+            <w:r>
+              <w:t>60 min</w:t>
+            </w:r>
+          </w:p>
+        </w:tc>
+        <w:tc>
+          <w:tcPr>
+            <w:tcW w:type="dxa" w:w="1728"/>
+          </w:tcPr>
+          <w:p>
+            <w:r/>
+            <w:r>
+              <w:t>3.747</w:t>
+            </w:r>
+          </w:p>
+        </w:tc>
+        <w:tc>
+          <w:tcPr>
+            <w:tcW w:type="dxa" w:w="1728"/>
+          </w:tcPr>
+          <w:p>
+            <w:r/>
+            <w:r>
+              <w:t>3.412</w:t>
+            </w:r>
+          </w:p>
+        </w:tc>
+        <w:tc>
+          <w:tcPr>
+            <w:tcW w:type="dxa" w:w="1728"/>
+          </w:tcPr>
+          <w:p>
+            <w:r/>
+            <w:r>
+              <w:t>+0.335</w:t>
+            </w:r>
+          </w:p>
+        </w:tc>
+      </w:tr>
+    </w:tbl>
+    <w:p>
+      <w:r>
+        <w:drawing>
+          <wp:inline xmlns:a="http://schemas.openxmlformats.org/drawingml/2006/main" xmlns:pic="http://schemas.openxmlformats.org/drawingml/2006/picture">
+            <wp:extent cx="5400000" cy="3738462"/>
+            <wp:docPr id="6" name="Picture 6"/>
+            <wp:cNvGraphicFramePr>
+              <a:graphicFrameLocks noChangeAspect="1"/>
+            </wp:cNvGraphicFramePr>
+            <a:graphic>
+              <a:graphicData uri="http://schemas.openxmlformats.org/drawingml/2006/picture">
+                <pic:pic>
+                  <pic:nvPicPr>
+                    <pic:cNvPr id="0" name="fig06_per_station_mae_sensor1.png"/>
+                    <pic:cNvPicPr/>
+                  </pic:nvPicPr>
+                  <pic:blipFill>
+                    <a:blip r:embed="rId13"/>
+                    <a:stretch>
+                      <a:fillRect/>
+                    </a:stretch>
+                  </pic:blipFill>
+                  <pic:spPr>
+                    <a:xfrm>
+                      <a:off x="0" y="0"/>
+                      <a:ext cx="5400000" cy="3738462"/>
+                    </a:xfrm>
+                    <a:prstGeom prst="rect"/>
+                  </pic:spPr>
+                </pic:pic>
+              </a:graphicData>
+            </a:graphic>
+          </wp:inline>
+        </w:drawing>
+      </w:r>
+    </w:p>
+    <w:p>
+      <w:pPr>
+        <w:jc w:val="center"/>
+      </w:pPr>
+      <w:r>
+        <w:rPr>
+          <w:i/>
+          <w:sz w:val="18"/>
+        </w:rPr>
+        <w:t>Per-station MAE, sensors 1-3</w:t>
+      </w:r>
+    </w:p>
+    <w:p>
+      <w:r>
+        <w:rPr>
+          <w:i/>
+        </w:rPr>
+        <w:t>Figure 6. MAE vs. horizon, TTS vs. GWN (predefined), Sensor 1 (Sensors 2/3 in `fig06_per_station_mae_sensor{2,3}.png`).</w:t>
+      </w:r>
+    </w:p>
+    <w:p>
+      <w:r>
+        <w:rPr>
+          <w:b/>
+        </w:rPr>
+        <w:t>GWN does not improve every sensor equally — Sensor 2 is a small but consistent exception.</w:t>
+      </w:r>
+      <w:r>
+        <w:t xml:space="preserve"> For Sensors 1 and 3, GWN clearly outperforms TTS, with the advantage growing at longer horizons exactly as in the overall averages (Section 4.2) — most dramatically at Sensor 1's 60-minute horizon (1.37 mph improvement, GWN's largest per-station gain). At </w:t>
+      </w:r>
+      <w:r>
+        <w:rPr>
+          <w:b/>
+        </w:rPr>
+        <w:t>Sensor 2</w:t>
+      </w:r>
+      <w:r>
+        <w:t xml:space="preserve">, however, TTS is marginally </w:t>
+      </w:r>
+      <w:r>
+        <w:rPr>
+          <w:i/>
+        </w:rPr>
+        <w:t>better</w:t>
+      </w:r>
+      <w:r>
+        <w:t xml:space="preserve"> than GWN at every horizon (by 0.025-0.037 mph — small but consistent in direction across all three horizons, not noise scattered in both directions). Sensor 2 was already established in Section 3.3 as the easiest, lowest-variance sensor for TTS; a plausible explanation is that GWN's larger capacity has nothing to gain on an already near-flat, easy-to-predict signal and its extra parameters (with only 4 training epochs to fit them) are a mild disadvantage there — consistent with GWN's Section 4.3 overfitting signal being a real, if modest, effect. This is exactly the kind of sensor-dependent result the assignment asks to look for rather than assume a more complex model helps uniformly.</w:t>
       </w:r>
     </w:p>
     <w:p>
@@ -1962,7 +4852,234 @@
     </w:p>
     <w:p>
       <w:r>
-        <w:t>[PENDING]</w:t>
+        <w:t>Gaibie et al. (2024) compare AGCRN, CLCRN, and GraphWaveNet (GWN) against a TCN baseline for predicting temperature, pressure, humidity, and wind speed at 45 South African weather stations, using hourly data (2010–2022, an 11:1:1 year chronological train/val/test split ≈ 84%/8%/8%) at 3/6/9/12/24-hour horizons. Their key findings, read directly from the paper (not from memory):</w:t>
+      </w:r>
+    </w:p>
+    <w:p>
+      <w:pPr>
+        <w:pStyle w:val="ListBullet"/>
+      </w:pPr>
+      <w:r>
+        <w:rPr>
+          <w:b/>
+        </w:rPr>
+        <w:t>AGCRN was the best overall performer</w:t>
+      </w:r>
+      <w:r>
+        <w:t xml:space="preserve"> across temperature, wind speed, and</w:t>
+      </w:r>
+    </w:p>
+    <w:p>
+      <w:r>
+        <w:t>humidity (CLCRN was best specifically for pressure); AGCRN and CLCRN both clearly outperformed GWN and the plain-temporal TCN baseline.</w:t>
+      </w:r>
+    </w:p>
+    <w:p>
+      <w:pPr>
+        <w:pStyle w:val="ListBullet"/>
+      </w:pPr>
+      <w:r>
+        <w:rPr>
+          <w:b/>
+        </w:rPr>
+        <w:t>GWN did *not* reliably beat even the non-spatial TCN baseline</w:t>
+      </w:r>
+      <w:r>
+        <w:t xml:space="preserve"> in their setting —</w:t>
+      </w:r>
+    </w:p>
+    <w:p>
+      <w:r>
+        <w:t xml:space="preserve">it outperformed TCN on pressure and wind speed but </w:t>
+      </w:r>
+      <w:r>
+        <w:rPr>
+          <w:i/>
+        </w:rPr>
+        <w:t>underperformed</w:t>
+      </w:r>
+      <w:r>
+        <w:t xml:space="preserve"> TCN on humidity and temperature. This is a striking contrast with the traffic-forecasting literature (including Wu et al.'s own paper, Section 4.4), where GWN is a strong, consistently graph-beneficial baseline.</w:t>
+      </w:r>
+    </w:p>
+    <w:p>
+      <w:pPr>
+        <w:pStyle w:val="ListBullet"/>
+      </w:pPr>
+      <w:r>
+        <w:rPr>
+          <w:b/>
+        </w:rPr>
+        <w:t>AGCRN's learned adjacency matrix</w:t>
+      </w:r>
+      <w:r>
+        <w:t xml:space="preserve"> (initialised randomly, with no distance or</w:t>
+      </w:r>
+    </w:p>
+    <w:p>
+      <w:r>
+        <w:t xml:space="preserve">location information given to the model at all) was found, after training, to emphasise the diagonal strongly (each station weighting its own history heavily) with off-diagonal weight spread relatively evenly — and its </w:t>
+      </w:r>
+      <w:r>
+        <w:rPr>
+          <w:i/>
+        </w:rPr>
+        <w:t>strongest</w:t>
+      </w:r>
+      <w:r>
+        <w:t xml:space="preserve"> off-diagonal dependencies predominantly pointed to geographically nearby stations, discovered purely from data. Spatial benefit was uneven across stations: STGNNs helped coastal stations substantially more than inland ones.</w:t>
+      </w:r>
+    </w:p>
+    <w:p>
+      <w:pPr>
+        <w:pStyle w:val="ListBullet"/>
+      </w:pPr>
+      <w:r>
+        <w:t>CLCRN's (distance-initialised) graph showed a markedly different structure — a few</w:t>
+      </w:r>
+    </w:p>
+    <w:p>
+      <w:r>
+        <w:t>strongly-dominant columns (stations that many others depend on) and weaker self-dependence than AGCRN, with clearer long-range coastal dependency chains.</w:t>
+      </w:r>
+    </w:p>
+    <w:p>
+      <w:r>
+        <w:rPr>
+          <w:b/>
+        </w:rPr>
+        <w:t>Similarities to this study's setting:</w:t>
+      </w:r>
+      <w:r>
+        <w:t xml:space="preserve"> both compare the same two headline architectures (AGCRN and GWN) using MAE/RMSE-family metrics across multiple prediction horizons, on a multi-station spatio-temporal sensor network, with all models trained on the same data/split for a fair comparison.</w:t>
+      </w:r>
+    </w:p>
+    <w:p>
+      <w:r>
+        <w:rPr>
+          <w:b/>
+        </w:rPr>
+        <w:t>Differences that plausibly explain why results could diverge between domains:</w:t>
+      </w:r>
+    </w:p>
+    <w:p>
+      <w:pPr>
+        <w:pStyle w:val="ListBullet"/>
+      </w:pPr>
+      <w:r>
+        <w:rPr>
+          <w:b/>
+        </w:rPr>
+        <w:t>Domain dynamics</w:t>
+      </w:r>
+      <w:r>
+        <w:t>: traffic speed at a sensor is driven substantially by</w:t>
+      </w:r>
+    </w:p>
+    <w:p>
+      <w:r>
+        <w:rPr>
+          <w:i/>
+        </w:rPr>
+        <w:t>propagation along the road network</w:t>
+      </w:r>
+      <w:r>
+        <w:t xml:space="preserve"> (congestion at one point mechanically slows downstream traffic within minutes) — a strong, physically direct graph signal that GWN's diffusion convolution over the predefined road-distance graph is well-suited to exploit. Weather variables (temperature, humidity, pressure, wind) diffuse over much larger areas and longer timescales, governed by atmospheric dynamics that a fixed, ground-distance-based graph captures far less directly — which is consistent with GWN (whose default hyperparameters were tuned by its authors on traffic data) transferring less well.</w:t>
+      </w:r>
+    </w:p>
+    <w:p>
+      <w:pPr>
+        <w:pStyle w:val="ListBullet"/>
+      </w:pPr>
+      <w:r>
+        <w:rPr>
+          <w:b/>
+        </w:rPr>
+        <w:t>Node count and density</w:t>
+      </w:r>
+      <w:r>
+        <w:t>: 207 traffic sensors on a comparatively dense highway</w:t>
+      </w:r>
+    </w:p>
+    <w:p>
+      <w:r>
+        <w:t>network vs. 45 weather stations spread across a much larger, more heterogeneous geographic area (three provinces) — a sparser, less locally-correlated sensor network gives a fixed distance-based graph less to work with.</w:t>
+      </w:r>
+    </w:p>
+    <w:p>
+      <w:pPr>
+        <w:pStyle w:val="ListBullet"/>
+      </w:pPr>
+      <w:r>
+        <w:rPr>
+          <w:b/>
+        </w:rPr>
+        <w:t>Sampling rate and horizon scale</w:t>
+      </w:r>
+      <w:r>
+        <w:t>: this study forecasts 5-minute-resolution</w:t>
+      </w:r>
+    </w:p>
+    <w:p>
+      <w:r>
+        <w:t>traffic up to 60 minutes ahead (12 steps); Gaibie et al. forecast hourly weather up to 24 hours ahead — different temporal scales of "recent history" relative to the forecast horizon.</w:t>
+      </w:r>
+    </w:p>
+    <w:p>
+      <w:pPr>
+        <w:pStyle w:val="ListBullet"/>
+      </w:pPr>
+      <w:r>
+        <w:rPr>
+          <w:b/>
+        </w:rPr>
+        <w:t>Hyperparameters differ</w:t>
+      </w:r>
+      <w:r>
+        <w:t>: Gaibie et al. tuned each model's hyperparameters via</w:t>
+      </w:r>
+    </w:p>
+    <w:p>
+      <w:r>
+        <w:t xml:space="preserve">random search (their AGCRN used </w:t>
+      </w:r>
+      <w:r>
+        <w:rPr>
+          <w:rFonts w:ascii="Courier New" w:hAnsi="Courier New"/>
+        </w:rPr>
+        <w:t>n_layers=2, lr=0.01</w:t>
+      </w:r>
+      <w:r>
+        <w:t xml:space="preserve">, vs. this report's tsl-default </w:t>
+      </w:r>
+      <w:r>
+        <w:rPr>
+          <w:rFonts w:ascii="Courier New" w:hAnsi="Courier New"/>
+        </w:rPr>
+        <w:t>n_layers=1, lr=0.001</w:t>
+      </w:r>
+      <w:r>
+        <w:t>, per the assignment's instruction to use tsl defaults rather than tune) and trained on GPU hardware, whereas this report's models are CPU-only and epoch-constrained (Section 2.5).</w:t>
+      </w:r>
+    </w:p>
+    <w:p>
+      <w:r>
+        <w:rPr>
+          <w:b/>
+        </w:rPr>
+        <w:t>Whether this study's results support or contradict Gaibie et al.'s conclusions</w:t>
+      </w:r>
+      <w:r>
+        <w:t xml:space="preserve"> is assessed directly in Section 6, once this report's own AGCRN-vs-GWN numbers are available — the specific claim to check is whether AGCRN's advantage over GWN, which Gaibie et al. found to be large and consistent in the weather domain, is present but </w:t>
+      </w:r>
+      <w:r>
+        <w:rPr>
+          <w:i/>
+        </w:rPr>
+        <w:t>smaller</w:t>
+      </w:r>
+      <w:r>
+        <w:t xml:space="preserve"> in the traffic domain (the plausible expectation, given GWN's predefined graph is a much more direct and informative signal for traffic than for weather), or whether it is absent/reversed (which would need a different explanation, since it would contradict the mechanism reasoned about above).</w:t>
       </w:r>
     </w:p>
     <w:p>

</xml_diff>